<commit_message>
fixing format of phôt
</commit_message>
<xml_diff>
--- a/Slot01/Excercise 1.docx
+++ b/Slot01/Excercise 1.docx
@@ -1,6 +1,6 @@
 
 <file path=word/document.xml><?xml version="1.0" encoding="utf-8"?>
-<w:document xmlns:wpc="http://schemas.microsoft.com/office/word/2010/wordprocessingCanvas" xmlns:cx="http://schemas.microsoft.com/office/drawing/2014/chartex" xmlns:cx1="http://schemas.microsoft.com/office/drawing/2015/9/8/chartex" xmlns:cx2="http://schemas.microsoft.com/office/drawing/2015/10/21/chartex" xmlns:cx3="http://schemas.microsoft.com/office/drawing/2016/5/9/chartex" xmlns:cx4="http://schemas.microsoft.com/office/drawing/2016/5/10/chartex" xmlns:cx5="http://schemas.microsoft.com/office/drawing/2016/5/11/chartex" xmlns:cx6="http://schemas.microsoft.com/office/drawing/2016/5/12/chartex" xmlns:cx7="http://schemas.microsoft.com/office/drawing/2016/5/13/chartex" xmlns:cx8="http://schemas.microsoft.com/office/drawing/2016/5/14/chartex" xmlns:mc="http://schemas.openxmlformats.org/markup-compatibility/2006" xmlns:aink="http://schemas.microsoft.com/office/drawing/2016/ink" xmlns:am3d="http://schemas.microsoft.com/office/drawing/2017/model3d" xmlns:o="urn:schemas-microsoft-com:office:office" xmlns:r="http://schemas.openxmlformats.org/officeDocument/2006/relationships" xmlns:m="http://schemas.openxmlformats.org/officeDocument/2006/math" xmlns:v="urn:schemas-microsoft-com:vml" xmlns:wp14="http://schemas.microsoft.com/office/word/2010/wordprocessingDrawing" xmlns:wp="http://schemas.openxmlformats.org/drawingml/2006/wordprocessingDrawing" xmlns:w10="urn:schemas-microsoft-com:office:word" xmlns:w="http://schemas.openxmlformats.org/wordprocessingml/2006/main" xmlns:w14="http://schemas.microsoft.com/office/word/2010/wordml" xmlns:w15="http://schemas.microsoft.com/office/word/2012/wordml" xmlns:w16cex="http://schemas.microsoft.com/office/word/2018/wordml/cex" xmlns:w16cid="http://schemas.microsoft.com/office/word/2016/wordml/cid" xmlns:w16="http://schemas.microsoft.com/office/word/2018/wordml" xmlns:w16se="http://schemas.microsoft.com/office/word/2015/wordml/symex" xmlns:wpg="http://schemas.microsoft.com/office/word/2010/wordprocessingGroup" xmlns:wpi="http://schemas.microsoft.com/office/word/2010/wordprocessingInk" xmlns:wne="http://schemas.microsoft.com/office/word/2006/wordml" xmlns:wps="http://schemas.microsoft.com/office/word/2010/wordprocessingShape" mc:Ignorable="w14 w15 w16se w16cid w16 w16cex wp14">
+<w:document xmlns:wpc="http://schemas.microsoft.com/office/word/2010/wordprocessingCanvas" xmlns:cx="http://schemas.microsoft.com/office/drawing/2014/chartex" xmlns:cx1="http://schemas.microsoft.com/office/drawing/2015/9/8/chartex" xmlns:cx2="http://schemas.microsoft.com/office/drawing/2015/10/21/chartex" xmlns:cx3="http://schemas.microsoft.com/office/drawing/2016/5/9/chartex" xmlns:cx4="http://schemas.microsoft.com/office/drawing/2016/5/10/chartex" xmlns:cx5="http://schemas.microsoft.com/office/drawing/2016/5/11/chartex" xmlns:cx6="http://schemas.microsoft.com/office/drawing/2016/5/12/chartex" xmlns:cx7="http://schemas.microsoft.com/office/drawing/2016/5/13/chartex" xmlns:cx8="http://schemas.microsoft.com/office/drawing/2016/5/14/chartex" xmlns:mc="http://schemas.openxmlformats.org/markup-compatibility/2006" xmlns:aink="http://schemas.microsoft.com/office/drawing/2016/ink" xmlns:am3d="http://schemas.microsoft.com/office/drawing/2017/model3d" xmlns:o="urn:schemas-microsoft-com:office:office" xmlns:oel="http://schemas.microsoft.com/office/2019/extlst" xmlns:r="http://schemas.openxmlformats.org/officeDocument/2006/relationships" xmlns:m="http://schemas.openxmlformats.org/officeDocument/2006/math" xmlns:v="urn:schemas-microsoft-com:vml" xmlns:wp14="http://schemas.microsoft.com/office/word/2010/wordprocessingDrawing" xmlns:wp="http://schemas.openxmlformats.org/drawingml/2006/wordprocessingDrawing" xmlns:w10="urn:schemas-microsoft-com:office:word" xmlns:w="http://schemas.openxmlformats.org/wordprocessingml/2006/main" xmlns:w14="http://schemas.microsoft.com/office/word/2010/wordml" xmlns:w15="http://schemas.microsoft.com/office/word/2012/wordml" xmlns:w16cex="http://schemas.microsoft.com/office/word/2018/wordml/cex" xmlns:w16cid="http://schemas.microsoft.com/office/word/2016/wordml/cid" xmlns:w16="http://schemas.microsoft.com/office/word/2018/wordml" xmlns:w16sdtdh="http://schemas.microsoft.com/office/word/2020/wordml/sdtdatahash" xmlns:w16se="http://schemas.microsoft.com/office/word/2015/wordml/symex" xmlns:wpg="http://schemas.microsoft.com/office/word/2010/wordprocessingGroup" xmlns:wpi="http://schemas.microsoft.com/office/word/2010/wordprocessingInk" xmlns:wne="http://schemas.microsoft.com/office/word/2006/wordml" xmlns:wps="http://schemas.microsoft.com/office/word/2010/wordprocessingShape" mc:Ignorable="w14 w15 w16se w16cid w16 w16cex w16sdtdh wp14">
   <w:body>
     <w:p>
       <w:pPr>
@@ -1149,21 +1149,7 @@
             <w:rStyle w:val="Hyperlink"/>
             <w:noProof/>
           </w:rPr>
-          <w:t>3.2.4.Tương tác với Remot</w:t>
-        </w:r>
-        <w:r>
-          <w:rPr>
-            <w:rStyle w:val="Hyperlink"/>
-            <w:noProof/>
-          </w:rPr>
-          <w:t>e</w:t>
-        </w:r>
-        <w:r>
-          <w:rPr>
-            <w:rStyle w:val="Hyperlink"/>
-            <w:noProof/>
-          </w:rPr>
-          <w:t xml:space="preserve"> Server:</w:t>
+          <w:t>3.2.4.Tương tác với Remote Server:</w:t>
         </w:r>
         <w:r>
           <w:rPr>
@@ -1305,55 +1291,7 @@
         </w:rPr>
         <w:t xml:space="preserve"> </w:t>
       </w:r>
-    </w:p>
-    <w:p>
-      <w:pPr>
-        <w:rPr>
-          <w:noProof/>
-        </w:rPr>
-      </w:pPr>
       <w:bookmarkStart w:id="0" w:name="_Toc229486621"/>
-      <w:r>
-        <w:br w:type="page"/>
-      </w:r>
-      <w:r>
-        <w:lastRenderedPageBreak/>
-        <w:drawing>
-          <wp:inline distT="0" distB="0" distL="0" distR="0" wp14:anchorId="450D80D6" wp14:editId="13370F60">
-            <wp:extent cx="5943600" cy="3346450"/>
-            <wp:effectExtent l="0" t="0" r="0" b="6350"/>
-            <wp:docPr id="5" name="Picture 5" descr="A screenshot of a computer program&#10;&#10;Description automatically generated"/>
-            <wp:cNvGraphicFramePr>
-              <a:graphicFrameLocks xmlns:a="http://schemas.openxmlformats.org/drawingml/2006/main" noChangeAspect="1"/>
-            </wp:cNvGraphicFramePr>
-            <a:graphic xmlns:a="http://schemas.openxmlformats.org/drawingml/2006/main">
-              <a:graphicData uri="http://schemas.openxmlformats.org/drawingml/2006/picture">
-                <pic:pic xmlns:pic="http://schemas.openxmlformats.org/drawingml/2006/picture">
-                  <pic:nvPicPr>
-                    <pic:cNvPr id="2" name="Picture 2" descr="A screenshot of a computer program&#10;&#10;Description automatically generated"/>
-                    <pic:cNvPicPr/>
-                  </pic:nvPicPr>
-                  <pic:blipFill>
-                    <a:blip r:embed="rId8"/>
-                    <a:stretch>
-                      <a:fillRect/>
-                    </a:stretch>
-                  </pic:blipFill>
-                  <pic:spPr>
-                    <a:xfrm>
-                      <a:off x="0" y="0"/>
-                      <a:ext cx="5943600" cy="3346450"/>
-                    </a:xfrm>
-                    <a:prstGeom prst="rect">
-                      <a:avLst/>
-                    </a:prstGeom>
-                  </pic:spPr>
-                </pic:pic>
-              </a:graphicData>
-            </a:graphic>
-          </wp:inline>
-        </w:drawing>
-      </w:r>
       <w:r>
         <w:fldChar w:fldCharType="begin"/>
       </w:r>
@@ -1446,47 +1384,13 @@
           <w:sz w:val="22"/>
         </w:rPr>
       </w:pPr>
-      <w:hyperlink w:anchor="_Toc229488763" w:history="1">
+      <w:hyperlink w:anchor="_Toc229488764" w:history="1">
         <w:r>
           <w:rPr>
             <w:rStyle w:val="Hyperlink"/>
             <w:noProof/>
           </w:rPr>
-          <w:drawing>
-            <wp:inline distT="0" distB="0" distL="0" distR="0" wp14:anchorId="29A3E31B" wp14:editId="0F4C4CB1">
-              <wp:extent cx="5943600" cy="3346450"/>
-              <wp:effectExtent l="0" t="0" r="0" b="6350"/>
-              <wp:docPr id="7" name="Picture 7" descr="A screenshot of a computer program&#10;&#10;Description automatically generated"/>
-              <wp:cNvGraphicFramePr>
-                <a:graphicFrameLocks xmlns:a="http://schemas.openxmlformats.org/drawingml/2006/main" noChangeAspect="1"/>
-              </wp:cNvGraphicFramePr>
-              <a:graphic xmlns:a="http://schemas.openxmlformats.org/drawingml/2006/main">
-                <a:graphicData uri="http://schemas.openxmlformats.org/drawingml/2006/picture">
-                  <pic:pic xmlns:pic="http://schemas.openxmlformats.org/drawingml/2006/picture">
-                    <pic:nvPicPr>
-                      <pic:cNvPr id="2" name="Picture 2" descr="A screenshot of a computer program&#10;&#10;Description automatically generated"/>
-                      <pic:cNvPicPr/>
-                    </pic:nvPicPr>
-                    <pic:blipFill>
-                      <a:blip r:embed="rId8"/>
-                      <a:stretch>
-                        <a:fillRect/>
-                      </a:stretch>
-                    </pic:blipFill>
-                    <pic:spPr>
-                      <a:xfrm>
-                        <a:off x="0" y="0"/>
-                        <a:ext cx="5943600" cy="3346450"/>
-                      </a:xfrm>
-                      <a:prstGeom prst="rect">
-                        <a:avLst/>
-                      </a:prstGeom>
-                    </pic:spPr>
-                  </pic:pic>
-                </a:graphicData>
-              </a:graphic>
-            </wp:inline>
-          </w:drawing>
+          <w:t>Hinh 2: Git la cai la gi</w:t>
         </w:r>
         <w:r>
           <w:rPr>
@@ -1507,7 +1411,7 @@
             <w:noProof/>
             <w:webHidden/>
           </w:rPr>
-          <w:instrText xml:space="preserve"> PAGEREF _Toc229488763 \h </w:instrText>
+          <w:instrText xml:space="preserve"> PAGEREF _Toc229488764 \h </w:instrText>
         </w:r>
         <w:r>
           <w:rPr>
@@ -1539,76 +1443,6 @@
       </w:hyperlink>
     </w:p>
     <w:p>
-      <w:pPr>
-        <w:pStyle w:val="TableofFigures"/>
-        <w:tabs>
-          <w:tab w:val="right" w:leader="dot" w:pos="9350"/>
-        </w:tabs>
-        <w:rPr>
-          <w:rFonts w:asciiTheme="minorHAnsi" w:hAnsiTheme="minorHAnsi"/>
-          <w:noProof/>
-          <w:sz w:val="22"/>
-        </w:rPr>
-      </w:pPr>
-      <w:hyperlink w:anchor="_Toc229488764" w:history="1">
-        <w:r>
-          <w:rPr>
-            <w:rStyle w:val="Hyperlink"/>
-            <w:noProof/>
-          </w:rPr>
-          <w:t>Hinh 2: Git la cai la gi</w:t>
-        </w:r>
-        <w:r>
-          <w:rPr>
-            <w:noProof/>
-            <w:webHidden/>
-          </w:rPr>
-          <w:tab/>
-        </w:r>
-        <w:r>
-          <w:rPr>
-            <w:noProof/>
-            <w:webHidden/>
-          </w:rPr>
-          <w:fldChar w:fldCharType="begin"/>
-        </w:r>
-        <w:r>
-          <w:rPr>
-            <w:noProof/>
-            <w:webHidden/>
-          </w:rPr>
-          <w:instrText xml:space="preserve"> PAGEREF _Toc229488764 \h </w:instrText>
-        </w:r>
-        <w:r>
-          <w:rPr>
-            <w:noProof/>
-            <w:webHidden/>
-          </w:rPr>
-        </w:r>
-        <w:r>
-          <w:rPr>
-            <w:noProof/>
-            <w:webHidden/>
-          </w:rPr>
-          <w:fldChar w:fldCharType="separate"/>
-        </w:r>
-        <w:r>
-          <w:rPr>
-            <w:noProof/>
-            <w:webHidden/>
-          </w:rPr>
-          <w:t>6</w:t>
-        </w:r>
-        <w:r>
-          <w:rPr>
-            <w:noProof/>
-            <w:webHidden/>
-          </w:rPr>
-          <w:fldChar w:fldCharType="end"/>
-        </w:r>
-      </w:hyperlink>
-    </w:p>
-    <w:p>
       <w:r>
         <w:fldChar w:fldCharType="end"/>
       </w:r>
@@ -1624,7 +1458,6 @@
         <w:pStyle w:val="Tieude1"/>
       </w:pPr>
       <w:r>
-        <w:lastRenderedPageBreak/>
         <w:t>1.</w:t>
       </w:r>
       <w:r>
@@ -2048,29 +1881,7 @@
           <w:sz w:val="24"/>
           <w:szCs w:val="24"/>
         </w:rPr>
-        <w:t>Inversion of Control (</w:t>
-      </w:r>
-      <w:proofErr w:type="spellStart"/>
-      <w:r>
-        <w:rPr>
-          <w:rFonts w:ascii="Times New Roman" w:eastAsia="Times New Roman" w:hAnsi="Times New Roman" w:cs="Times New Roman"/>
-          <w:b/>
-          <w:bCs/>
-          <w:sz w:val="24"/>
-          <w:szCs w:val="24"/>
-        </w:rPr>
-        <w:t>IoC</w:t>
-      </w:r>
-      <w:proofErr w:type="spellEnd"/>
-      <w:r>
-        <w:rPr>
-          <w:rFonts w:ascii="Times New Roman" w:eastAsia="Times New Roman" w:hAnsi="Times New Roman" w:cs="Times New Roman"/>
-          <w:b/>
-          <w:bCs/>
-          <w:sz w:val="24"/>
-          <w:szCs w:val="24"/>
-        </w:rPr>
-        <w:t>)</w:t>
+        <w:t>Inversion of Control (IoC)</w:t>
       </w:r>
       <w:r>
         <w:rPr>
@@ -2867,7 +2678,25 @@
           <w:sz w:val="24"/>
           <w:szCs w:val="24"/>
         </w:rPr>
-        <w:t xml:space="preserve"> Spring. Thay </w:t>
+        <w:t xml:space="preserve"> Spring. </w:t>
+      </w:r>
+      <w:proofErr w:type="spellStart"/>
+      <w:r>
+        <w:rPr>
+          <w:rFonts w:ascii="Times New Roman" w:eastAsia="Times New Roman" w:hAnsi="Times New Roman" w:cs="Times New Roman"/>
+          <w:sz w:val="24"/>
+          <w:szCs w:val="24"/>
+        </w:rPr>
+        <w:t>Thay</w:t>
+      </w:r>
+      <w:proofErr w:type="spellEnd"/>
+      <w:r>
+        <w:rPr>
+          <w:rFonts w:ascii="Times New Roman" w:eastAsia="Times New Roman" w:hAnsi="Times New Roman" w:cs="Times New Roman"/>
+          <w:sz w:val="24"/>
+          <w:szCs w:val="24"/>
+        </w:rPr>
+        <w:t xml:space="preserve"> </w:t>
       </w:r>
       <w:proofErr w:type="spellStart"/>
       <w:r>
@@ -4601,7 +4430,25 @@
                 <w:sz w:val="24"/>
                 <w:szCs w:val="24"/>
               </w:rPr>
-              <w:t xml:space="preserve"> ra "</w:t>
+              <w:t xml:space="preserve"> </w:t>
+            </w:r>
+            <w:proofErr w:type="spellStart"/>
+            <w:r>
+              <w:rPr>
+                <w:rFonts w:ascii="Times New Roman" w:eastAsia="Times New Roman" w:hAnsi="Times New Roman" w:cs="Times New Roman"/>
+                <w:sz w:val="24"/>
+                <w:szCs w:val="24"/>
+              </w:rPr>
+              <w:t>ra</w:t>
+            </w:r>
+            <w:proofErr w:type="spellEnd"/>
+            <w:r>
+              <w:rPr>
+                <w:rFonts w:ascii="Times New Roman" w:eastAsia="Times New Roman" w:hAnsi="Times New Roman" w:cs="Times New Roman"/>
+                <w:sz w:val="24"/>
+                <w:szCs w:val="24"/>
+              </w:rPr>
+              <w:t xml:space="preserve"> "</w:t>
             </w:r>
             <w:proofErr w:type="spellStart"/>
             <w:r>
@@ -5232,6 +5079,7 @@
           <w:sz w:val="26"/>
           <w:szCs w:val="26"/>
         </w:rPr>
+        <w:lastRenderedPageBreak/>
         <w:t>Các</w:t>
       </w:r>
       <w:proofErr w:type="spellEnd"/>
@@ -5706,7 +5554,6 @@
       </w:pPr>
       <w:proofErr w:type="spellStart"/>
       <w:r>
-        <w:lastRenderedPageBreak/>
         <w:t>Dựa</w:t>
       </w:r>
       <w:proofErr w:type="spellEnd"/>
@@ -5878,8 +5725,13 @@
       <w:pPr>
         <w:pStyle w:val="Style1"/>
       </w:pPr>
-      <w:r>
-        <w:t xml:space="preserve">Công </w:t>
+      <w:proofErr w:type="spellStart"/>
+      <w:r>
+        <w:t>Công</w:t>
+      </w:r>
+      <w:proofErr w:type="spellEnd"/>
+      <w:r>
+        <w:t xml:space="preserve"> </w:t>
       </w:r>
       <w:proofErr w:type="spellStart"/>
       <w:r>
@@ -5998,8 +5850,13 @@
       <w:pPr>
         <w:pStyle w:val="Style1"/>
       </w:pPr>
-      <w:r>
-        <w:t xml:space="preserve">Cung </w:t>
+      <w:proofErr w:type="spellStart"/>
+      <w:r>
+        <w:t>Cung</w:t>
+      </w:r>
+      <w:proofErr w:type="spellEnd"/>
+      <w:r>
+        <w:t xml:space="preserve"> </w:t>
       </w:r>
       <w:proofErr w:type="spellStart"/>
       <w:r>
@@ -6110,8 +5967,13 @@
       <w:pPr>
         <w:pStyle w:val="Style1"/>
       </w:pPr>
-      <w:r>
-        <w:t xml:space="preserve">Công </w:t>
+      <w:proofErr w:type="spellStart"/>
+      <w:r>
+        <w:t>Công</w:t>
+      </w:r>
+      <w:proofErr w:type="spellEnd"/>
+      <w:r>
+        <w:t xml:space="preserve"> </w:t>
       </w:r>
       <w:proofErr w:type="spellStart"/>
       <w:r>
@@ -6221,10 +6083,10 @@
     <w:p>
       <w:r>
         <w:drawing>
-          <wp:inline distT="0" distB="0" distL="0" distR="0" wp14:anchorId="11A5A5A9" wp14:editId="3861F857">
-            <wp:extent cx="5943600" cy="3346450"/>
-            <wp:effectExtent l="0" t="0" r="0" b="6350"/>
-            <wp:docPr id="1" name="Picture 1" descr="A screenshot of a computer program&#10;&#10;Description automatically generated"/>
+          <wp:inline distT="0" distB="0" distL="0" distR="0" wp14:anchorId="584D1301" wp14:editId="53CB221F">
+            <wp:extent cx="5943600" cy="3142615"/>
+            <wp:effectExtent l="0" t="0" r="0" b="0"/>
+            <wp:docPr id="1201263682" name="Picture 1"/>
             <wp:cNvGraphicFramePr>
               <a:graphicFrameLocks xmlns:a="http://schemas.openxmlformats.org/drawingml/2006/main" noChangeAspect="1"/>
             </wp:cNvGraphicFramePr>
@@ -6232,7 +6094,7 @@
               <a:graphicData uri="http://schemas.openxmlformats.org/drawingml/2006/picture">
                 <pic:pic xmlns:pic="http://schemas.openxmlformats.org/drawingml/2006/picture">
                   <pic:nvPicPr>
-                    <pic:cNvPr id="1" name="Picture 1" descr="A screenshot of a computer program&#10;&#10;Description automatically generated"/>
+                    <pic:cNvPr id="1201263682" name=""/>
                     <pic:cNvPicPr/>
                   </pic:nvPicPr>
                   <pic:blipFill>
@@ -6244,7 +6106,7 @@
                   <pic:spPr>
                     <a:xfrm>
                       <a:off x="0" y="0"/>
-                      <a:ext cx="5943600" cy="3346450"/>
+                      <a:ext cx="5943600" cy="3142615"/>
                     </a:xfrm>
                     <a:prstGeom prst="rect">
                       <a:avLst/>
@@ -6262,8 +6124,13 @@
         <w:pStyle w:val="TieuDeHinh"/>
       </w:pPr>
       <w:bookmarkStart w:id="10" w:name="_Toc229488762"/>
-      <w:r>
-        <w:t xml:space="preserve">Hinh 1: Khoi </w:t>
+      <w:proofErr w:type="spellStart"/>
+      <w:r>
+        <w:t>Hinh</w:t>
+      </w:r>
+      <w:proofErr w:type="spellEnd"/>
+      <w:r>
+        <w:t xml:space="preserve"> 1: Khoi </w:t>
       </w:r>
       <w:proofErr w:type="spellStart"/>
       <w:r>
@@ -6347,6 +6214,7 @@
       </w:pPr>
       <w:bookmarkStart w:id="12" w:name="_Toc229486632"/>
       <w:r>
+        <w:lastRenderedPageBreak/>
         <w:t>3.</w:t>
       </w:r>
       <w:proofErr w:type="gramStart"/>
@@ -6662,7 +6530,6 @@
       </w:r>
       <w:proofErr w:type="spellStart"/>
       <w:r>
-        <w:lastRenderedPageBreak/>
         <w:t>đầy</w:t>
       </w:r>
       <w:proofErr w:type="spellEnd"/>
@@ -6826,13 +6693,12 @@
       <w:pPr>
         <w:pStyle w:val="TieuDeHinh"/>
       </w:pPr>
-      <w:bookmarkStart w:id="13" w:name="_Toc229488763"/>
       <w:r>
         <w:drawing>
-          <wp:inline distT="0" distB="0" distL="0" distR="0" wp14:anchorId="09D11B4E" wp14:editId="1F1A23D2">
-            <wp:extent cx="5943600" cy="3346450"/>
-            <wp:effectExtent l="0" t="0" r="0" b="6350"/>
-            <wp:docPr id="2" name="Picture 2" descr="A screenshot of a computer program&#10;&#10;Description automatically generated"/>
+          <wp:inline distT="0" distB="0" distL="0" distR="0" wp14:anchorId="4EB58259" wp14:editId="700FFAA9">
+            <wp:extent cx="5943600" cy="3007360"/>
+            <wp:effectExtent l="0" t="0" r="0" b="2540"/>
+            <wp:docPr id="1980049213" name="Picture 1"/>
             <wp:cNvGraphicFramePr>
               <a:graphicFrameLocks xmlns:a="http://schemas.openxmlformats.org/drawingml/2006/main" noChangeAspect="1"/>
             </wp:cNvGraphicFramePr>
@@ -6840,11 +6706,11 @@
               <a:graphicData uri="http://schemas.openxmlformats.org/drawingml/2006/picture">
                 <pic:pic xmlns:pic="http://schemas.openxmlformats.org/drawingml/2006/picture">
                   <pic:nvPicPr>
-                    <pic:cNvPr id="2" name="Picture 2" descr="A screenshot of a computer program&#10;&#10;Description automatically generated"/>
+                    <pic:cNvPr id="1980049213" name=""/>
                     <pic:cNvPicPr/>
                   </pic:nvPicPr>
                   <pic:blipFill>
-                    <a:blip r:embed="rId8"/>
+                    <a:blip r:embed="rId9"/>
                     <a:stretch>
                       <a:fillRect/>
                     </a:stretch>
@@ -6852,7 +6718,7 @@
                   <pic:spPr>
                     <a:xfrm>
                       <a:off x="0" y="0"/>
-                      <a:ext cx="5943600" cy="3346450"/>
+                      <a:ext cx="5943600" cy="3007360"/>
                     </a:xfrm>
                     <a:prstGeom prst="rect">
                       <a:avLst/>
@@ -6864,39 +6730,41 @@
           </wp:inline>
         </w:drawing>
       </w:r>
-      <w:bookmarkEnd w:id="13"/>
     </w:p>
     <w:p>
       <w:pPr>
         <w:pStyle w:val="TieuDeHinh"/>
-      </w:pPr>
-      <w:bookmarkStart w:id="14" w:name="_Toc229488764"/>
-      <w:r>
-        <w:t xml:space="preserve">Hinh 2: Git la </w:t>
-      </w:r>
-      <w:proofErr w:type="spellStart"/>
-      <w:r>
-        <w:t>cai</w:t>
-      </w:r>
-      <w:proofErr w:type="spellEnd"/>
-      <w:r>
-        <w:t xml:space="preserve"> la</w:t>
-      </w:r>
-      <w:r>
-        <w:t xml:space="preserve"> </w:t>
-      </w:r>
-      <w:proofErr w:type="spellStart"/>
-      <w:r>
-        <w:t>gi</w:t>
-      </w:r>
-      <w:bookmarkEnd w:id="14"/>
-      <w:proofErr w:type="spellEnd"/>
+        <w:rPr>
+          <w:lang w:val="vi-VN"/>
+        </w:rPr>
+      </w:pPr>
+      <w:bookmarkStart w:id="13" w:name="_Toc229488764"/>
+      <w:proofErr w:type="spellStart"/>
+      <w:r>
+        <w:t>Hinh</w:t>
+      </w:r>
+      <w:proofErr w:type="spellEnd"/>
+      <w:r>
+        <w:t xml:space="preserve"> 2: Git </w:t>
+      </w:r>
+      <w:bookmarkEnd w:id="13"/>
+      <w:proofErr w:type="spellStart"/>
+      <w:r>
+        <w:t>là</w:t>
+      </w:r>
+      <w:proofErr w:type="spellEnd"/>
+      <w:r>
+        <w:rPr>
+          <w:lang w:val="vi-VN"/>
+        </w:rPr>
+        <w:t xml:space="preserve"> gì</w:t>
+      </w:r>
     </w:p>
     <w:p>
       <w:pPr>
         <w:pStyle w:val="Tieude11"/>
       </w:pPr>
-      <w:bookmarkStart w:id="15" w:name="_Toc229486633"/>
+      <w:bookmarkStart w:id="14" w:name="_Toc229486633"/>
       <w:r>
         <w:t>3.</w:t>
       </w:r>
@@ -6939,14 +6807,14 @@
       <w:r>
         <w:t>bản</w:t>
       </w:r>
-      <w:bookmarkEnd w:id="15"/>
+      <w:bookmarkEnd w:id="14"/>
       <w:proofErr w:type="spellEnd"/>
     </w:p>
     <w:p>
       <w:pPr>
         <w:pStyle w:val="Tieude111"/>
       </w:pPr>
-      <w:bookmarkStart w:id="16" w:name="_Toc229486634"/>
+      <w:bookmarkStart w:id="15" w:name="_Toc229486634"/>
       <w:r>
         <w:t>3.2.</w:t>
       </w:r>
@@ -6976,6 +6844,231 @@
       <w:proofErr w:type="spellEnd"/>
       <w:r>
         <w:t xml:space="preserve"> code:</w:t>
+      </w:r>
+      <w:bookmarkEnd w:id="15"/>
+    </w:p>
+    <w:p>
+      <w:pPr>
+        <w:pStyle w:val="Style1"/>
+      </w:pPr>
+      <w:r>
+        <w:rPr>
+          <w:rFonts w:ascii="Courier New" w:hAnsi="Courier New" w:cs="Courier New"/>
+          <w:sz w:val="20"/>
+          <w:szCs w:val="20"/>
+        </w:rPr>
+        <w:t xml:space="preserve">git </w:t>
+      </w:r>
+      <w:proofErr w:type="spellStart"/>
+      <w:r>
+        <w:rPr>
+          <w:rFonts w:ascii="Courier New" w:hAnsi="Courier New" w:cs="Courier New"/>
+          <w:sz w:val="20"/>
+          <w:szCs w:val="20"/>
+        </w:rPr>
+        <w:t>init</w:t>
+      </w:r>
+      <w:proofErr w:type="spellEnd"/>
+      <w:r>
+        <w:t xml:space="preserve">: </w:t>
+      </w:r>
+      <w:proofErr w:type="spellStart"/>
+      <w:r>
+        <w:t>Khởi</w:t>
+      </w:r>
+      <w:proofErr w:type="spellEnd"/>
+      <w:r>
+        <w:t xml:space="preserve"> </w:t>
+      </w:r>
+      <w:proofErr w:type="spellStart"/>
+      <w:r>
+        <w:t>tạo</w:t>
+      </w:r>
+      <w:proofErr w:type="spellEnd"/>
+      <w:r>
+        <w:t xml:space="preserve"> </w:t>
+      </w:r>
+      <w:proofErr w:type="spellStart"/>
+      <w:r>
+        <w:t>một</w:t>
+      </w:r>
+      <w:proofErr w:type="spellEnd"/>
+      <w:r>
+        <w:t xml:space="preserve"> repo </w:t>
+      </w:r>
+      <w:proofErr w:type="spellStart"/>
+      <w:r>
+        <w:t>mới</w:t>
+      </w:r>
+      <w:proofErr w:type="spellEnd"/>
+      <w:r>
+        <w:t xml:space="preserve"> </w:t>
+      </w:r>
+      <w:proofErr w:type="spellStart"/>
+      <w:r>
+        <w:t>tại</w:t>
+      </w:r>
+      <w:proofErr w:type="spellEnd"/>
+      <w:r>
+        <w:t xml:space="preserve"> </w:t>
+      </w:r>
+      <w:proofErr w:type="spellStart"/>
+      <w:r>
+        <w:t>thư</w:t>
+      </w:r>
+      <w:proofErr w:type="spellEnd"/>
+      <w:r>
+        <w:t xml:space="preserve"> </w:t>
+      </w:r>
+      <w:proofErr w:type="spellStart"/>
+      <w:r>
+        <w:t>mục</w:t>
+      </w:r>
+      <w:proofErr w:type="spellEnd"/>
+      <w:r>
+        <w:t xml:space="preserve"> </w:t>
+      </w:r>
+      <w:proofErr w:type="spellStart"/>
+      <w:r>
+        <w:t>hiện</w:t>
+      </w:r>
+      <w:proofErr w:type="spellEnd"/>
+      <w:r>
+        <w:t xml:space="preserve"> </w:t>
+      </w:r>
+      <w:proofErr w:type="spellStart"/>
+      <w:r>
+        <w:t>tại</w:t>
+      </w:r>
+      <w:proofErr w:type="spellEnd"/>
+      <w:r>
+        <w:t>.</w:t>
+      </w:r>
+    </w:p>
+    <w:p>
+      <w:pPr>
+        <w:pStyle w:val="Style1"/>
+      </w:pPr>
+      <w:r>
+        <w:rPr>
+          <w:rFonts w:ascii="Courier New" w:hAnsi="Courier New" w:cs="Courier New"/>
+          <w:sz w:val="20"/>
+          <w:szCs w:val="20"/>
+        </w:rPr>
+        <w:t>git clone [</w:t>
+      </w:r>
+      <w:proofErr w:type="spellStart"/>
+      <w:r>
+        <w:rPr>
+          <w:rFonts w:ascii="Courier New" w:hAnsi="Courier New" w:cs="Courier New"/>
+          <w:sz w:val="20"/>
+          <w:szCs w:val="20"/>
+        </w:rPr>
+        <w:t>url</w:t>
+      </w:r>
+      <w:proofErr w:type="spellEnd"/>
+      <w:r>
+        <w:rPr>
+          <w:rFonts w:ascii="Courier New" w:hAnsi="Courier New" w:cs="Courier New"/>
+          <w:sz w:val="20"/>
+          <w:szCs w:val="20"/>
+        </w:rPr>
+        <w:t>]</w:t>
+      </w:r>
+      <w:r>
+        <w:t xml:space="preserve">: Sao </w:t>
+      </w:r>
+      <w:proofErr w:type="spellStart"/>
+      <w:r>
+        <w:t>chép</w:t>
+      </w:r>
+      <w:proofErr w:type="spellEnd"/>
+      <w:r>
+        <w:t xml:space="preserve"> </w:t>
+      </w:r>
+      <w:proofErr w:type="spellStart"/>
+      <w:r>
+        <w:t>một</w:t>
+      </w:r>
+      <w:proofErr w:type="spellEnd"/>
+      <w:r>
+        <w:t xml:space="preserve"> repository </w:t>
+      </w:r>
+      <w:proofErr w:type="spellStart"/>
+      <w:r>
+        <w:t>từ</w:t>
+      </w:r>
+      <w:proofErr w:type="spellEnd"/>
+      <w:r>
+        <w:t xml:space="preserve"> server </w:t>
+      </w:r>
+      <w:proofErr w:type="spellStart"/>
+      <w:r>
+        <w:t>về</w:t>
+      </w:r>
+      <w:proofErr w:type="spellEnd"/>
+      <w:r>
+        <w:t xml:space="preserve"> </w:t>
+      </w:r>
+      <w:proofErr w:type="spellStart"/>
+      <w:r>
+        <w:t>máy</w:t>
+      </w:r>
+      <w:proofErr w:type="spellEnd"/>
+      <w:r>
+        <w:t>.</w:t>
+      </w:r>
+    </w:p>
+    <w:p>
+      <w:pPr>
+        <w:pStyle w:val="Tieude111"/>
+      </w:pPr>
+      <w:bookmarkStart w:id="16" w:name="_Toc229486635"/>
+      <w:r>
+        <w:t>3.2.</w:t>
+      </w:r>
+      <w:proofErr w:type="gramStart"/>
+      <w:r>
+        <w:t>2.</w:t>
+      </w:r>
+      <w:r>
+        <w:t>Làm</w:t>
+      </w:r>
+      <w:proofErr w:type="gramEnd"/>
+      <w:r>
+        <w:t xml:space="preserve"> </w:t>
+      </w:r>
+      <w:proofErr w:type="spellStart"/>
+      <w:r>
+        <w:t>việc</w:t>
+      </w:r>
+      <w:proofErr w:type="spellEnd"/>
+      <w:r>
+        <w:t xml:space="preserve"> </w:t>
+      </w:r>
+      <w:proofErr w:type="spellStart"/>
+      <w:r>
+        <w:t>với</w:t>
+      </w:r>
+      <w:proofErr w:type="spellEnd"/>
+      <w:r>
+        <w:t xml:space="preserve"> </w:t>
+      </w:r>
+      <w:proofErr w:type="spellStart"/>
+      <w:r>
+        <w:t>thay</w:t>
+      </w:r>
+      <w:proofErr w:type="spellEnd"/>
+      <w:r>
+        <w:t xml:space="preserve"> </w:t>
+      </w:r>
+      <w:proofErr w:type="spellStart"/>
+      <w:r>
+        <w:t>đổi</w:t>
+      </w:r>
+      <w:proofErr w:type="spellEnd"/>
+      <w:r>
+        <w:t>:</w:t>
       </w:r>
       <w:bookmarkEnd w:id="16"/>
     </w:p>
@@ -6989,182 +7082,297 @@
           <w:sz w:val="20"/>
           <w:szCs w:val="20"/>
         </w:rPr>
-        <w:t xml:space="preserve">git </w:t>
-      </w:r>
-      <w:proofErr w:type="spellStart"/>
+        <w:t>git status</w:t>
+      </w:r>
+      <w:r>
+        <w:t xml:space="preserve">: </w:t>
+      </w:r>
+      <w:proofErr w:type="spellStart"/>
+      <w:r>
+        <w:t>Kiểm</w:t>
+      </w:r>
+      <w:proofErr w:type="spellEnd"/>
+      <w:r>
+        <w:t xml:space="preserve"> </w:t>
+      </w:r>
+      <w:proofErr w:type="spellStart"/>
+      <w:r>
+        <w:t>tra</w:t>
+      </w:r>
+      <w:proofErr w:type="spellEnd"/>
+      <w:r>
+        <w:t xml:space="preserve"> </w:t>
+      </w:r>
+      <w:proofErr w:type="spellStart"/>
+      <w:r>
+        <w:t>trạng</w:t>
+      </w:r>
+      <w:proofErr w:type="spellEnd"/>
+      <w:r>
+        <w:t xml:space="preserve"> </w:t>
+      </w:r>
+      <w:proofErr w:type="spellStart"/>
+      <w:r>
+        <w:t>thái</w:t>
+      </w:r>
+      <w:proofErr w:type="spellEnd"/>
+      <w:r>
+        <w:t xml:space="preserve"> </w:t>
+      </w:r>
+      <w:proofErr w:type="spellStart"/>
+      <w:r>
+        <w:t>các</w:t>
+      </w:r>
+      <w:proofErr w:type="spellEnd"/>
+      <w:r>
+        <w:t xml:space="preserve"> file (</w:t>
+      </w:r>
+      <w:proofErr w:type="spellStart"/>
+      <w:r>
+        <w:t>đã</w:t>
+      </w:r>
+      <w:proofErr w:type="spellEnd"/>
+      <w:r>
+        <w:t xml:space="preserve"> </w:t>
+      </w:r>
+      <w:proofErr w:type="spellStart"/>
+      <w:r>
+        <w:t>sửa</w:t>
+      </w:r>
+      <w:proofErr w:type="spellEnd"/>
+      <w:r>
+        <w:t xml:space="preserve">, </w:t>
+      </w:r>
+      <w:proofErr w:type="spellStart"/>
+      <w:r>
+        <w:t>đã</w:t>
+      </w:r>
+      <w:proofErr w:type="spellEnd"/>
+      <w:r>
+        <w:t xml:space="preserve"> add hay </w:t>
+      </w:r>
+      <w:proofErr w:type="spellStart"/>
+      <w:r>
+        <w:t>chưa</w:t>
+      </w:r>
+      <w:proofErr w:type="spellEnd"/>
+      <w:r>
+        <w:t>).</w:t>
+      </w:r>
+    </w:p>
+    <w:p>
+      <w:pPr>
+        <w:pStyle w:val="Style1"/>
+      </w:pPr>
       <w:r>
         <w:rPr>
           <w:rFonts w:ascii="Courier New" w:hAnsi="Courier New" w:cs="Courier New"/>
           <w:sz w:val="20"/>
           <w:szCs w:val="20"/>
         </w:rPr>
-        <w:t>init</w:t>
-      </w:r>
-      <w:proofErr w:type="spellEnd"/>
-      <w:r>
-        <w:t xml:space="preserve">: </w:t>
-      </w:r>
-      <w:proofErr w:type="spellStart"/>
-      <w:r>
-        <w:t>Khởi</w:t>
-      </w:r>
-      <w:proofErr w:type="spellEnd"/>
-      <w:r>
-        <w:t xml:space="preserve"> </w:t>
-      </w:r>
-      <w:proofErr w:type="spellStart"/>
-      <w:r>
-        <w:t>tạo</w:t>
-      </w:r>
-      <w:proofErr w:type="spellEnd"/>
-      <w:r>
-        <w:t xml:space="preserve"> </w:t>
-      </w:r>
-      <w:proofErr w:type="spellStart"/>
-      <w:r>
-        <w:t>một</w:t>
-      </w:r>
-      <w:proofErr w:type="spellEnd"/>
-      <w:r>
-        <w:t xml:space="preserve"> repo </w:t>
-      </w:r>
-      <w:proofErr w:type="spellStart"/>
-      <w:r>
-        <w:t>mới</w:t>
-      </w:r>
-      <w:proofErr w:type="spellEnd"/>
-      <w:r>
-        <w:t xml:space="preserve"> </w:t>
-      </w:r>
-      <w:proofErr w:type="spellStart"/>
-      <w:r>
-        <w:t>tại</w:t>
-      </w:r>
-      <w:proofErr w:type="spellEnd"/>
-      <w:r>
-        <w:t xml:space="preserve"> </w:t>
-      </w:r>
-      <w:proofErr w:type="spellStart"/>
-      <w:r>
-        <w:t>thư</w:t>
-      </w:r>
-      <w:proofErr w:type="spellEnd"/>
-      <w:r>
-        <w:t xml:space="preserve"> </w:t>
-      </w:r>
-      <w:proofErr w:type="spellStart"/>
-      <w:r>
-        <w:t>mục</w:t>
-      </w:r>
-      <w:proofErr w:type="spellEnd"/>
-      <w:r>
-        <w:t xml:space="preserve"> </w:t>
-      </w:r>
-      <w:proofErr w:type="spellStart"/>
-      <w:r>
-        <w:t>hiện</w:t>
-      </w:r>
-      <w:proofErr w:type="spellEnd"/>
-      <w:r>
-        <w:t xml:space="preserve"> </w:t>
-      </w:r>
-      <w:proofErr w:type="spellStart"/>
-      <w:r>
-        <w:t>tại</w:t>
-      </w:r>
-      <w:proofErr w:type="spellEnd"/>
-      <w:r>
-        <w:t>.</w:t>
-      </w:r>
-    </w:p>
-    <w:p>
-      <w:pPr>
-        <w:pStyle w:val="Style1"/>
-      </w:pPr>
+        <w:t>git add [</w:t>
+      </w:r>
+      <w:proofErr w:type="spellStart"/>
       <w:r>
         <w:rPr>
           <w:rFonts w:ascii="Courier New" w:hAnsi="Courier New" w:cs="Courier New"/>
           <w:sz w:val="20"/>
           <w:szCs w:val="20"/>
         </w:rPr>
-        <w:t>git clone [</w:t>
-      </w:r>
-      <w:proofErr w:type="spellStart"/>
+        <w:t>file_name</w:t>
+      </w:r>
+      <w:proofErr w:type="spellEnd"/>
       <w:r>
         <w:rPr>
           <w:rFonts w:ascii="Courier New" w:hAnsi="Courier New" w:cs="Courier New"/>
           <w:sz w:val="20"/>
           <w:szCs w:val="20"/>
         </w:rPr>
-        <w:t>url</w:t>
-      </w:r>
-      <w:proofErr w:type="spellEnd"/>
+        <w:t>]</w:t>
+      </w:r>
+      <w:r>
+        <w:t xml:space="preserve"> </w:t>
+      </w:r>
+      <w:proofErr w:type="spellStart"/>
+      <w:r>
+        <w:t>hoặc</w:t>
+      </w:r>
+      <w:proofErr w:type="spellEnd"/>
+      <w:r>
+        <w:t xml:space="preserve"> </w:t>
+      </w:r>
       <w:r>
         <w:rPr>
           <w:rFonts w:ascii="Courier New" w:hAnsi="Courier New" w:cs="Courier New"/>
           <w:sz w:val="20"/>
           <w:szCs w:val="20"/>
         </w:rPr>
-        <w:t>]</w:t>
-      </w:r>
-      <w:r>
-        <w:t xml:space="preserve">: Sao </w:t>
-      </w:r>
-      <w:proofErr w:type="spellStart"/>
-      <w:r>
-        <w:t>chép</w:t>
-      </w:r>
-      <w:proofErr w:type="spellEnd"/>
-      <w:r>
-        <w:t xml:space="preserve"> </w:t>
-      </w:r>
-      <w:proofErr w:type="spellStart"/>
-      <w:r>
-        <w:t>một</w:t>
-      </w:r>
-      <w:proofErr w:type="spellEnd"/>
-      <w:r>
-        <w:t xml:space="preserve"> repository </w:t>
-      </w:r>
-      <w:proofErr w:type="spellStart"/>
-      <w:r>
-        <w:t>từ</w:t>
-      </w:r>
-      <w:proofErr w:type="spellEnd"/>
-      <w:r>
-        <w:t xml:space="preserve"> server </w:t>
-      </w:r>
-      <w:proofErr w:type="spellStart"/>
-      <w:r>
-        <w:t>về</w:t>
-      </w:r>
-      <w:proofErr w:type="spellEnd"/>
-      <w:r>
-        <w:t xml:space="preserve"> </w:t>
-      </w:r>
-      <w:proofErr w:type="spellStart"/>
-      <w:r>
-        <w:t>máy</w:t>
-      </w:r>
-      <w:proofErr w:type="spellEnd"/>
-      <w:r>
-        <w:t>.</w:t>
+        <w:t xml:space="preserve">git </w:t>
+      </w:r>
+      <w:proofErr w:type="gramStart"/>
+      <w:r>
+        <w:rPr>
+          <w:rFonts w:ascii="Courier New" w:hAnsi="Courier New" w:cs="Courier New"/>
+          <w:sz w:val="20"/>
+          <w:szCs w:val="20"/>
+        </w:rPr>
+        <w:t>add .</w:t>
+      </w:r>
+      <w:proofErr w:type="gramEnd"/>
+      <w:r>
+        <w:t xml:space="preserve">: </w:t>
+      </w:r>
+      <w:proofErr w:type="spellStart"/>
+      <w:r>
+        <w:t>Đưa</w:t>
+      </w:r>
+      <w:proofErr w:type="spellEnd"/>
+      <w:r>
+        <w:t xml:space="preserve"> file </w:t>
+      </w:r>
+      <w:proofErr w:type="spellStart"/>
+      <w:r>
+        <w:t>vào</w:t>
+      </w:r>
+      <w:proofErr w:type="spellEnd"/>
+      <w:r>
+        <w:t xml:space="preserve"> </w:t>
+      </w:r>
+      <w:proofErr w:type="spellStart"/>
+      <w:r>
+        <w:t>vùng</w:t>
+      </w:r>
+      <w:proofErr w:type="spellEnd"/>
+      <w:r>
+        <w:t xml:space="preserve"> </w:t>
+      </w:r>
+      <w:proofErr w:type="spellStart"/>
+      <w:r>
+        <w:t>chờ</w:t>
+      </w:r>
+      <w:proofErr w:type="spellEnd"/>
+      <w:r>
+        <w:t xml:space="preserve"> (Staging Area).</w:t>
       </w:r>
     </w:p>
     <w:p>
       <w:pPr>
+        <w:pStyle w:val="Style1"/>
+      </w:pPr>
+      <w:r>
+        <w:rPr>
+          <w:rFonts w:ascii="Courier New" w:hAnsi="Courier New" w:cs="Courier New"/>
+          <w:sz w:val="20"/>
+          <w:szCs w:val="20"/>
+        </w:rPr>
+        <w:t>git commit -m "message"</w:t>
+      </w:r>
+      <w:r>
+        <w:t xml:space="preserve">: </w:t>
+      </w:r>
+      <w:proofErr w:type="spellStart"/>
+      <w:r>
+        <w:t>Lưu</w:t>
+      </w:r>
+      <w:proofErr w:type="spellEnd"/>
+      <w:r>
+        <w:t xml:space="preserve"> </w:t>
+      </w:r>
+      <w:proofErr w:type="spellStart"/>
+      <w:r>
+        <w:t>lại</w:t>
+      </w:r>
+      <w:proofErr w:type="spellEnd"/>
+      <w:r>
+        <w:t xml:space="preserve"> </w:t>
+      </w:r>
+      <w:proofErr w:type="spellStart"/>
+      <w:r>
+        <w:t>ảnh</w:t>
+      </w:r>
+      <w:proofErr w:type="spellEnd"/>
+      <w:r>
+        <w:t xml:space="preserve"> </w:t>
+      </w:r>
+      <w:proofErr w:type="spellStart"/>
+      <w:r>
+        <w:t>chụp</w:t>
+      </w:r>
+      <w:proofErr w:type="spellEnd"/>
+      <w:r>
+        <w:t xml:space="preserve"> (snapshot) </w:t>
+      </w:r>
+      <w:proofErr w:type="spellStart"/>
+      <w:r>
+        <w:t>của</w:t>
+      </w:r>
+      <w:proofErr w:type="spellEnd"/>
+      <w:r>
+        <w:t xml:space="preserve"> </w:t>
+      </w:r>
+      <w:proofErr w:type="spellStart"/>
+      <w:r>
+        <w:t>các</w:t>
+      </w:r>
+      <w:proofErr w:type="spellEnd"/>
+      <w:r>
+        <w:t xml:space="preserve"> </w:t>
+      </w:r>
+      <w:proofErr w:type="spellStart"/>
+      <w:r>
+        <w:t>thay</w:t>
+      </w:r>
+      <w:proofErr w:type="spellEnd"/>
+      <w:r>
+        <w:t xml:space="preserve"> </w:t>
+      </w:r>
+      <w:proofErr w:type="spellStart"/>
+      <w:r>
+        <w:t>đổi</w:t>
+      </w:r>
+      <w:proofErr w:type="spellEnd"/>
+      <w:r>
+        <w:t xml:space="preserve"> </w:t>
+      </w:r>
+      <w:proofErr w:type="spellStart"/>
+      <w:r>
+        <w:t>vào</w:t>
+      </w:r>
+      <w:proofErr w:type="spellEnd"/>
+      <w:r>
+        <w:t xml:space="preserve"> </w:t>
+      </w:r>
+      <w:proofErr w:type="spellStart"/>
+      <w:r>
+        <w:t>lịch</w:t>
+      </w:r>
+      <w:proofErr w:type="spellEnd"/>
+      <w:r>
+        <w:t xml:space="preserve"> </w:t>
+      </w:r>
+      <w:proofErr w:type="spellStart"/>
+      <w:r>
+        <w:t>sử</w:t>
+      </w:r>
+      <w:proofErr w:type="spellEnd"/>
+      <w:r>
+        <w:t xml:space="preserve"> local.</w:t>
+      </w:r>
+    </w:p>
+    <w:p>
+      <w:pPr>
         <w:pStyle w:val="Tieude111"/>
       </w:pPr>
-      <w:bookmarkStart w:id="17" w:name="_Toc229486635"/>
+      <w:bookmarkStart w:id="17" w:name="_Toc229486636"/>
       <w:r>
         <w:t>3.2.</w:t>
       </w:r>
       <w:proofErr w:type="gramStart"/>
       <w:r>
-        <w:t>2.</w:t>
-      </w:r>
-      <w:r>
-        <w:t>Làm</w:t>
+        <w:t>3.</w:t>
+      </w:r>
+      <w:r>
+        <w:t>Quản</w:t>
       </w:r>
       <w:proofErr w:type="gramEnd"/>
       <w:r>
@@ -7172,35 +7380,19 @@
       </w:r>
       <w:proofErr w:type="spellStart"/>
       <w:r>
-        <w:t>việc</w:t>
-      </w:r>
-      <w:proofErr w:type="spellEnd"/>
-      <w:r>
-        <w:t xml:space="preserve"> </w:t>
-      </w:r>
-      <w:proofErr w:type="spellStart"/>
-      <w:r>
-        <w:t>với</w:t>
-      </w:r>
-      <w:proofErr w:type="spellEnd"/>
-      <w:r>
-        <w:t xml:space="preserve"> </w:t>
-      </w:r>
-      <w:proofErr w:type="spellStart"/>
-      <w:r>
-        <w:t>thay</w:t>
-      </w:r>
-      <w:proofErr w:type="spellEnd"/>
-      <w:r>
-        <w:t xml:space="preserve"> </w:t>
-      </w:r>
-      <w:proofErr w:type="spellStart"/>
-      <w:r>
-        <w:t>đổi</w:t>
-      </w:r>
-      <w:proofErr w:type="spellEnd"/>
-      <w:r>
-        <w:t>:</w:t>
+        <w:t>lý</w:t>
+      </w:r>
+      <w:proofErr w:type="spellEnd"/>
+      <w:r>
+        <w:t xml:space="preserve"> </w:t>
+      </w:r>
+      <w:proofErr w:type="spellStart"/>
+      <w:r>
+        <w:t>nhánh</w:t>
+      </w:r>
+      <w:proofErr w:type="spellEnd"/>
+      <w:r>
+        <w:t xml:space="preserve"> (Branching):</w:t>
       </w:r>
       <w:bookmarkEnd w:id="17"/>
     </w:p>
@@ -7214,38 +7406,23 @@
           <w:sz w:val="20"/>
           <w:szCs w:val="20"/>
         </w:rPr>
-        <w:t>git status</w:t>
+        <w:lastRenderedPageBreak/>
+        <w:t>git branch</w:t>
       </w:r>
       <w:r>
         <w:t xml:space="preserve">: </w:t>
       </w:r>
       <w:proofErr w:type="spellStart"/>
       <w:r>
-        <w:t>Kiểm</w:t>
-      </w:r>
-      <w:proofErr w:type="spellEnd"/>
-      <w:r>
-        <w:t xml:space="preserve"> </w:t>
-      </w:r>
-      <w:proofErr w:type="spellStart"/>
-      <w:r>
-        <w:t>tra</w:t>
-      </w:r>
-      <w:proofErr w:type="spellEnd"/>
-      <w:r>
-        <w:t xml:space="preserve"> </w:t>
-      </w:r>
-      <w:proofErr w:type="spellStart"/>
-      <w:r>
-        <w:t>trạng</w:t>
-      </w:r>
-      <w:proofErr w:type="spellEnd"/>
-      <w:r>
-        <w:t xml:space="preserve"> </w:t>
-      </w:r>
-      <w:proofErr w:type="spellStart"/>
-      <w:r>
-        <w:t>thái</w:t>
+        <w:t>Liệt</w:t>
+      </w:r>
+      <w:proofErr w:type="spellEnd"/>
+      <w:r>
+        <w:t xml:space="preserve"> </w:t>
+      </w:r>
+      <w:proofErr w:type="spellStart"/>
+      <w:r>
+        <w:t>kê</w:t>
       </w:r>
       <w:proofErr w:type="spellEnd"/>
       <w:r>
@@ -7257,39 +7434,31 @@
       </w:r>
       <w:proofErr w:type="spellEnd"/>
       <w:r>
-        <w:t xml:space="preserve"> file (</w:t>
-      </w:r>
-      <w:proofErr w:type="spellStart"/>
-      <w:r>
-        <w:t>đã</w:t>
-      </w:r>
-      <w:proofErr w:type="spellEnd"/>
-      <w:r>
-        <w:t xml:space="preserve"> </w:t>
-      </w:r>
-      <w:proofErr w:type="spellStart"/>
-      <w:r>
-        <w:t>sửa</w:t>
-      </w:r>
-      <w:proofErr w:type="spellEnd"/>
-      <w:r>
-        <w:t xml:space="preserve">, </w:t>
-      </w:r>
-      <w:proofErr w:type="spellStart"/>
-      <w:r>
-        <w:t>đã</w:t>
-      </w:r>
-      <w:proofErr w:type="spellEnd"/>
-      <w:r>
-        <w:t xml:space="preserve"> add hay </w:t>
-      </w:r>
-      <w:proofErr w:type="spellStart"/>
-      <w:r>
-        <w:t>chưa</w:t>
-      </w:r>
-      <w:proofErr w:type="spellEnd"/>
-      <w:r>
-        <w:t>).</w:t>
+        <w:t xml:space="preserve"> </w:t>
+      </w:r>
+      <w:proofErr w:type="spellStart"/>
+      <w:r>
+        <w:t>nhánh</w:t>
+      </w:r>
+      <w:proofErr w:type="spellEnd"/>
+      <w:r>
+        <w:t xml:space="preserve"> </w:t>
+      </w:r>
+      <w:proofErr w:type="spellStart"/>
+      <w:r>
+        <w:t>hiện</w:t>
+      </w:r>
+      <w:proofErr w:type="spellEnd"/>
+      <w:r>
+        <w:t xml:space="preserve"> </w:t>
+      </w:r>
+      <w:proofErr w:type="spellStart"/>
+      <w:r>
+        <w:t>có</w:t>
+      </w:r>
+      <w:proofErr w:type="spellEnd"/>
+      <w:r>
+        <w:t>.</w:t>
       </w:r>
     </w:p>
     <w:p>
@@ -7302,7 +7471,7 @@
           <w:sz w:val="20"/>
           <w:szCs w:val="20"/>
         </w:rPr>
-        <w:t>git add [</w:t>
+        <w:t>git checkout -b [</w:t>
       </w:r>
       <w:proofErr w:type="spellStart"/>
       <w:r>
@@ -7311,7 +7480,7 @@
           <w:sz w:val="20"/>
           <w:szCs w:val="20"/>
         </w:rPr>
-        <w:t>file_name</w:t>
+        <w:t>branch_name</w:t>
       </w:r>
       <w:proofErr w:type="spellEnd"/>
       <w:r>
@@ -7323,144 +7492,118 @@
         <w:t>]</w:t>
       </w:r>
       <w:r>
-        <w:t xml:space="preserve"> </w:t>
-      </w:r>
-      <w:proofErr w:type="spellStart"/>
-      <w:r>
-        <w:t>hoặc</w:t>
-      </w:r>
-      <w:proofErr w:type="spellEnd"/>
-      <w:r>
-        <w:t xml:space="preserve"> </w:t>
-      </w:r>
+        <w:t xml:space="preserve">: </w:t>
+      </w:r>
+      <w:proofErr w:type="spellStart"/>
+      <w:r>
+        <w:t>Tạo</w:t>
+      </w:r>
+      <w:proofErr w:type="spellEnd"/>
+      <w:r>
+        <w:t xml:space="preserve"> </w:t>
+      </w:r>
+      <w:proofErr w:type="spellStart"/>
+      <w:r>
+        <w:t>nhánh</w:t>
+      </w:r>
+      <w:proofErr w:type="spellEnd"/>
+      <w:r>
+        <w:t xml:space="preserve"> </w:t>
+      </w:r>
+      <w:proofErr w:type="spellStart"/>
+      <w:r>
+        <w:t>mới</w:t>
+      </w:r>
+      <w:proofErr w:type="spellEnd"/>
+      <w:r>
+        <w:t xml:space="preserve"> </w:t>
+      </w:r>
+      <w:proofErr w:type="spellStart"/>
+      <w:r>
+        <w:t>và</w:t>
+      </w:r>
+      <w:proofErr w:type="spellEnd"/>
+      <w:r>
+        <w:t xml:space="preserve"> </w:t>
+      </w:r>
+      <w:proofErr w:type="spellStart"/>
+      <w:r>
+        <w:t>chuyển</w:t>
+      </w:r>
+      <w:proofErr w:type="spellEnd"/>
+      <w:r>
+        <w:t xml:space="preserve"> sang </w:t>
+      </w:r>
+      <w:proofErr w:type="spellStart"/>
+      <w:r>
+        <w:t>nhánh</w:t>
+      </w:r>
+      <w:proofErr w:type="spellEnd"/>
+      <w:r>
+        <w:t xml:space="preserve"> </w:t>
+      </w:r>
+      <w:proofErr w:type="spellStart"/>
+      <w:r>
+        <w:t>đó</w:t>
+      </w:r>
+      <w:proofErr w:type="spellEnd"/>
+      <w:r>
+        <w:t>.</w:t>
+      </w:r>
+    </w:p>
+    <w:p>
+      <w:pPr>
+        <w:pStyle w:val="Style1"/>
+      </w:pPr>
+      <w:bookmarkStart w:id="18" w:name="_Toc229488072"/>
       <w:r>
         <w:rPr>
           <w:rFonts w:ascii="Courier New" w:hAnsi="Courier New" w:cs="Courier New"/>
           <w:sz w:val="20"/>
           <w:szCs w:val="20"/>
         </w:rPr>
-        <w:t xml:space="preserve">git </w:t>
-      </w:r>
-      <w:proofErr w:type="gramStart"/>
+        <w:t>git merge [</w:t>
+      </w:r>
+      <w:proofErr w:type="spellStart"/>
       <w:r>
         <w:rPr>
           <w:rFonts w:ascii="Courier New" w:hAnsi="Courier New" w:cs="Courier New"/>
           <w:sz w:val="20"/>
           <w:szCs w:val="20"/>
         </w:rPr>
-        <w:t>add .</w:t>
-      </w:r>
-      <w:proofErr w:type="gramEnd"/>
-      <w:r>
-        <w:t xml:space="preserve">: </w:t>
-      </w:r>
-      <w:proofErr w:type="spellStart"/>
-      <w:r>
-        <w:t>Đưa</w:t>
-      </w:r>
-      <w:proofErr w:type="spellEnd"/>
-      <w:r>
-        <w:t xml:space="preserve"> file </w:t>
-      </w:r>
-      <w:proofErr w:type="spellStart"/>
-      <w:r>
-        <w:t>vào</w:t>
-      </w:r>
-      <w:proofErr w:type="spellEnd"/>
-      <w:r>
-        <w:t xml:space="preserve"> </w:t>
-      </w:r>
-      <w:proofErr w:type="spellStart"/>
-      <w:r>
-        <w:t>vùng</w:t>
-      </w:r>
-      <w:proofErr w:type="spellEnd"/>
-      <w:r>
-        <w:t xml:space="preserve"> </w:t>
-      </w:r>
-      <w:proofErr w:type="spellStart"/>
-      <w:r>
-        <w:t>chờ</w:t>
-      </w:r>
-      <w:proofErr w:type="spellEnd"/>
-      <w:r>
-        <w:t xml:space="preserve"> (Staging Area).</w:t>
-      </w:r>
-    </w:p>
-    <w:p>
-      <w:pPr>
-        <w:pStyle w:val="Style1"/>
-      </w:pPr>
+        <w:t>branch_name</w:t>
+      </w:r>
+      <w:proofErr w:type="spellEnd"/>
       <w:r>
         <w:rPr>
           <w:rFonts w:ascii="Courier New" w:hAnsi="Courier New" w:cs="Courier New"/>
           <w:sz w:val="20"/>
           <w:szCs w:val="20"/>
         </w:rPr>
-        <w:t>git commit -m "message"</w:t>
+        <w:t>]</w:t>
       </w:r>
       <w:r>
         <w:t xml:space="preserve">: </w:t>
       </w:r>
       <w:proofErr w:type="spellStart"/>
       <w:r>
-        <w:t>Lưu</w:t>
-      </w:r>
-      <w:proofErr w:type="spellEnd"/>
-      <w:r>
-        <w:t xml:space="preserve"> </w:t>
-      </w:r>
-      <w:proofErr w:type="spellStart"/>
-      <w:r>
-        <w:t>lại</w:t>
-      </w:r>
-      <w:proofErr w:type="spellEnd"/>
-      <w:r>
-        <w:t xml:space="preserve"> </w:t>
-      </w:r>
-      <w:proofErr w:type="spellStart"/>
-      <w:r>
-        <w:t>ảnh</w:t>
-      </w:r>
-      <w:proofErr w:type="spellEnd"/>
-      <w:r>
-        <w:t xml:space="preserve"> </w:t>
-      </w:r>
-      <w:proofErr w:type="spellStart"/>
-      <w:r>
-        <w:t>chụp</w:t>
-      </w:r>
-      <w:proofErr w:type="spellEnd"/>
-      <w:r>
-        <w:t xml:space="preserve"> (snapshot) </w:t>
-      </w:r>
-      <w:proofErr w:type="spellStart"/>
-      <w:r>
-        <w:t>của</w:t>
-      </w:r>
-      <w:proofErr w:type="spellEnd"/>
-      <w:r>
-        <w:t xml:space="preserve"> </w:t>
-      </w:r>
-      <w:proofErr w:type="spellStart"/>
-      <w:r>
-        <w:t>các</w:t>
-      </w:r>
-      <w:proofErr w:type="spellEnd"/>
-      <w:r>
-        <w:t xml:space="preserve"> </w:t>
-      </w:r>
-      <w:proofErr w:type="spellStart"/>
-      <w:r>
-        <w:t>thay</w:t>
-      </w:r>
-      <w:proofErr w:type="spellEnd"/>
-      <w:r>
-        <w:t xml:space="preserve"> </w:t>
-      </w:r>
-      <w:proofErr w:type="spellStart"/>
-      <w:r>
-        <w:t>đổi</w:t>
+        <w:t>Gộp</w:t>
+      </w:r>
+      <w:proofErr w:type="spellEnd"/>
+      <w:r>
+        <w:t xml:space="preserve"> </w:t>
+      </w:r>
+      <w:proofErr w:type="spellStart"/>
+      <w:r>
+        <w:t>nhánh</w:t>
+      </w:r>
+      <w:proofErr w:type="spellEnd"/>
+      <w:r>
+        <w:t xml:space="preserve"> </w:t>
+      </w:r>
+      <w:proofErr w:type="spellStart"/>
+      <w:r>
+        <w:t>khác</w:t>
       </w:r>
       <w:proofErr w:type="spellEnd"/>
       <w:r>
@@ -7476,341 +7619,66 @@
       </w:r>
       <w:proofErr w:type="spellStart"/>
       <w:r>
-        <w:t>lịch</w:t>
-      </w:r>
-      <w:proofErr w:type="spellEnd"/>
-      <w:r>
-        <w:t xml:space="preserve"> </w:t>
-      </w:r>
-      <w:proofErr w:type="spellStart"/>
-      <w:r>
-        <w:t>sử</w:t>
-      </w:r>
-      <w:proofErr w:type="spellEnd"/>
-      <w:r>
-        <w:t xml:space="preserve"> local.</w:t>
-      </w:r>
-    </w:p>
-    <w:p>
-      <w:pPr>
-        <w:pStyle w:val="Tieude111"/>
-      </w:pPr>
-      <w:bookmarkStart w:id="18" w:name="_Toc229486636"/>
-      <w:r>
-        <w:t>3.2.</w:t>
-      </w:r>
-      <w:proofErr w:type="gramStart"/>
-      <w:r>
-        <w:t>3.</w:t>
-      </w:r>
-      <w:r>
-        <w:t>Quản</w:t>
-      </w:r>
-      <w:proofErr w:type="gramEnd"/>
-      <w:r>
-        <w:t xml:space="preserve"> </w:t>
-      </w:r>
-      <w:proofErr w:type="spellStart"/>
-      <w:r>
-        <w:t>lý</w:t>
-      </w:r>
-      <w:proofErr w:type="spellEnd"/>
-      <w:r>
-        <w:t xml:space="preserve"> </w:t>
-      </w:r>
-      <w:proofErr w:type="spellStart"/>
-      <w:r>
         <w:t>nhánh</w:t>
       </w:r>
       <w:proofErr w:type="spellEnd"/>
       <w:r>
-        <w:t xml:space="preserve"> (Branching):</w:t>
+        <w:t xml:space="preserve"> </w:t>
+      </w:r>
+      <w:proofErr w:type="spellStart"/>
+      <w:r>
+        <w:t>hiện</w:t>
+      </w:r>
+      <w:proofErr w:type="spellEnd"/>
+      <w:r>
+        <w:t xml:space="preserve"> </w:t>
+      </w:r>
+      <w:proofErr w:type="spellStart"/>
+      <w:r>
+        <w:t>tại</w:t>
+      </w:r>
+      <w:proofErr w:type="spellEnd"/>
+      <w:r>
+        <w:t>.</w:t>
       </w:r>
       <w:bookmarkEnd w:id="18"/>
     </w:p>
     <w:p>
       <w:pPr>
-        <w:pStyle w:val="Style1"/>
-      </w:pPr>
-      <w:r>
-        <w:rPr>
-          <w:rFonts w:ascii="Courier New" w:hAnsi="Courier New" w:cs="Courier New"/>
-          <w:sz w:val="20"/>
-          <w:szCs w:val="20"/>
-        </w:rPr>
-        <w:t>git branch</w:t>
-      </w:r>
-      <w:r>
-        <w:t xml:space="preserve">: </w:t>
-      </w:r>
-      <w:proofErr w:type="spellStart"/>
-      <w:r>
-        <w:t>Liệt</w:t>
-      </w:r>
-      <w:proofErr w:type="spellEnd"/>
-      <w:r>
-        <w:t xml:space="preserve"> </w:t>
-      </w:r>
-      <w:proofErr w:type="spellStart"/>
-      <w:r>
-        <w:t>kê</w:t>
-      </w:r>
-      <w:proofErr w:type="spellEnd"/>
-      <w:r>
-        <w:t xml:space="preserve"> </w:t>
-      </w:r>
-      <w:proofErr w:type="spellStart"/>
-      <w:r>
-        <w:t>các</w:t>
-      </w:r>
-      <w:proofErr w:type="spellEnd"/>
-      <w:r>
-        <w:t xml:space="preserve"> </w:t>
-      </w:r>
-      <w:proofErr w:type="spellStart"/>
-      <w:r>
-        <w:t>nhánh</w:t>
-      </w:r>
-      <w:proofErr w:type="spellEnd"/>
-      <w:r>
-        <w:t xml:space="preserve"> </w:t>
-      </w:r>
-      <w:proofErr w:type="spellStart"/>
-      <w:r>
-        <w:t>hiện</w:t>
-      </w:r>
-      <w:proofErr w:type="spellEnd"/>
-      <w:r>
-        <w:t xml:space="preserve"> </w:t>
-      </w:r>
-      <w:proofErr w:type="spellStart"/>
-      <w:r>
-        <w:t>có</w:t>
-      </w:r>
-      <w:proofErr w:type="spellEnd"/>
-      <w:r>
-        <w:t>.</w:t>
-      </w:r>
-    </w:p>
-    <w:p>
-      <w:pPr>
-        <w:pStyle w:val="Style1"/>
-      </w:pPr>
-      <w:r>
-        <w:rPr>
-          <w:rFonts w:ascii="Courier New" w:hAnsi="Courier New" w:cs="Courier New"/>
-          <w:sz w:val="20"/>
-          <w:szCs w:val="20"/>
-        </w:rPr>
-        <w:lastRenderedPageBreak/>
-        <w:t>git checkout -b [</w:t>
-      </w:r>
-      <w:proofErr w:type="spellStart"/>
-      <w:r>
-        <w:rPr>
-          <w:rFonts w:ascii="Courier New" w:hAnsi="Courier New" w:cs="Courier New"/>
-          <w:sz w:val="20"/>
-          <w:szCs w:val="20"/>
-        </w:rPr>
-        <w:t>branch_name</w:t>
-      </w:r>
-      <w:proofErr w:type="spellEnd"/>
-      <w:r>
-        <w:rPr>
-          <w:rFonts w:ascii="Courier New" w:hAnsi="Courier New" w:cs="Courier New"/>
-          <w:sz w:val="20"/>
-          <w:szCs w:val="20"/>
-        </w:rPr>
-        <w:t>]</w:t>
-      </w:r>
-      <w:r>
-        <w:t xml:space="preserve">: </w:t>
-      </w:r>
-      <w:proofErr w:type="spellStart"/>
-      <w:r>
-        <w:t>Tạo</w:t>
-      </w:r>
-      <w:proofErr w:type="spellEnd"/>
-      <w:r>
-        <w:t xml:space="preserve"> </w:t>
-      </w:r>
-      <w:proofErr w:type="spellStart"/>
-      <w:r>
-        <w:t>nhánh</w:t>
-      </w:r>
-      <w:proofErr w:type="spellEnd"/>
-      <w:r>
-        <w:t xml:space="preserve"> </w:t>
-      </w:r>
-      <w:proofErr w:type="spellStart"/>
-      <w:r>
-        <w:t>mới</w:t>
-      </w:r>
-      <w:proofErr w:type="spellEnd"/>
-      <w:r>
-        <w:t xml:space="preserve"> </w:t>
-      </w:r>
-      <w:proofErr w:type="spellStart"/>
-      <w:r>
-        <w:t>và</w:t>
-      </w:r>
-      <w:proofErr w:type="spellEnd"/>
-      <w:r>
-        <w:t xml:space="preserve"> </w:t>
-      </w:r>
-      <w:proofErr w:type="spellStart"/>
-      <w:r>
-        <w:t>chuyển</w:t>
-      </w:r>
-      <w:proofErr w:type="spellEnd"/>
-      <w:r>
-        <w:t xml:space="preserve"> sang </w:t>
-      </w:r>
-      <w:proofErr w:type="spellStart"/>
-      <w:r>
-        <w:t>nhánh</w:t>
-      </w:r>
-      <w:proofErr w:type="spellEnd"/>
-      <w:r>
-        <w:t xml:space="preserve"> </w:t>
-      </w:r>
-      <w:proofErr w:type="spellStart"/>
-      <w:r>
-        <w:t>đó</w:t>
-      </w:r>
-      <w:proofErr w:type="spellEnd"/>
-      <w:r>
-        <w:t>.</w:t>
-      </w:r>
-    </w:p>
-    <w:p>
-      <w:pPr>
-        <w:pStyle w:val="Style1"/>
-      </w:pPr>
-      <w:bookmarkStart w:id="19" w:name="_Toc229488072"/>
-      <w:r>
-        <w:rPr>
-          <w:rFonts w:ascii="Courier New" w:hAnsi="Courier New" w:cs="Courier New"/>
-          <w:sz w:val="20"/>
-          <w:szCs w:val="20"/>
-        </w:rPr>
-        <w:t>git merge [</w:t>
-      </w:r>
-      <w:proofErr w:type="spellStart"/>
-      <w:r>
-        <w:rPr>
-          <w:rFonts w:ascii="Courier New" w:hAnsi="Courier New" w:cs="Courier New"/>
-          <w:sz w:val="20"/>
-          <w:szCs w:val="20"/>
-        </w:rPr>
-        <w:t>branch_name</w:t>
-      </w:r>
-      <w:proofErr w:type="spellEnd"/>
-      <w:r>
-        <w:rPr>
-          <w:rFonts w:ascii="Courier New" w:hAnsi="Courier New" w:cs="Courier New"/>
-          <w:sz w:val="20"/>
-          <w:szCs w:val="20"/>
-        </w:rPr>
-        <w:t>]</w:t>
-      </w:r>
-      <w:r>
-        <w:t xml:space="preserve">: </w:t>
-      </w:r>
-      <w:proofErr w:type="spellStart"/>
-      <w:r>
-        <w:t>Gộp</w:t>
-      </w:r>
-      <w:proofErr w:type="spellEnd"/>
-      <w:r>
-        <w:t xml:space="preserve"> </w:t>
-      </w:r>
-      <w:proofErr w:type="spellStart"/>
-      <w:r>
-        <w:t>nhánh</w:t>
-      </w:r>
-      <w:proofErr w:type="spellEnd"/>
-      <w:r>
-        <w:t xml:space="preserve"> </w:t>
-      </w:r>
-      <w:proofErr w:type="spellStart"/>
-      <w:r>
-        <w:t>khác</w:t>
-      </w:r>
-      <w:proofErr w:type="spellEnd"/>
-      <w:r>
-        <w:t xml:space="preserve"> </w:t>
-      </w:r>
-      <w:proofErr w:type="spellStart"/>
-      <w:r>
-        <w:t>vào</w:t>
-      </w:r>
-      <w:proofErr w:type="spellEnd"/>
-      <w:r>
-        <w:t xml:space="preserve"> </w:t>
-      </w:r>
-      <w:proofErr w:type="spellStart"/>
-      <w:r>
-        <w:t>nhánh</w:t>
-      </w:r>
-      <w:proofErr w:type="spellEnd"/>
-      <w:r>
-        <w:t xml:space="preserve"> </w:t>
-      </w:r>
-      <w:proofErr w:type="spellStart"/>
-      <w:r>
-        <w:t>hiện</w:t>
-      </w:r>
-      <w:proofErr w:type="spellEnd"/>
-      <w:r>
-        <w:t xml:space="preserve"> </w:t>
-      </w:r>
-      <w:proofErr w:type="spellStart"/>
-      <w:r>
-        <w:t>tại</w:t>
-      </w:r>
-      <w:proofErr w:type="spellEnd"/>
-      <w:r>
-        <w:t>.</w:t>
+        <w:pStyle w:val="Tieude111"/>
+      </w:pPr>
+      <w:bookmarkStart w:id="19" w:name="_Toc229486637"/>
+      <w:r>
+        <w:t>3.2.</w:t>
+      </w:r>
+      <w:proofErr w:type="gramStart"/>
+      <w:r>
+        <w:t>4.</w:t>
+      </w:r>
+      <w:r>
+        <w:t>Tương</w:t>
+      </w:r>
+      <w:proofErr w:type="gramEnd"/>
+      <w:r>
+        <w:t xml:space="preserve"> </w:t>
+      </w:r>
+      <w:proofErr w:type="spellStart"/>
+      <w:r>
+        <w:t>tác</w:t>
+      </w:r>
+      <w:proofErr w:type="spellEnd"/>
+      <w:r>
+        <w:t xml:space="preserve"> </w:t>
+      </w:r>
+      <w:proofErr w:type="spellStart"/>
+      <w:r>
+        <w:t>với</w:t>
+      </w:r>
+      <w:proofErr w:type="spellEnd"/>
+      <w:r>
+        <w:t xml:space="preserve"> Remote Server:</w:t>
       </w:r>
       <w:bookmarkEnd w:id="19"/>
-    </w:p>
-    <w:p>
-      <w:pPr>
-        <w:pStyle w:val="Tieude111"/>
-      </w:pPr>
-      <w:bookmarkStart w:id="20" w:name="_Toc229486637"/>
-      <w:r>
-        <w:t>3.2.</w:t>
-      </w:r>
-      <w:proofErr w:type="gramStart"/>
-      <w:r>
-        <w:t>4.</w:t>
-      </w:r>
-      <w:r>
-        <w:t>Tương</w:t>
-      </w:r>
-      <w:proofErr w:type="gramEnd"/>
-      <w:r>
-        <w:t xml:space="preserve"> </w:t>
-      </w:r>
-      <w:proofErr w:type="spellStart"/>
-      <w:r>
-        <w:t>tác</w:t>
-      </w:r>
-      <w:proofErr w:type="spellEnd"/>
-      <w:r>
-        <w:t xml:space="preserve"> </w:t>
-      </w:r>
-      <w:proofErr w:type="spellStart"/>
-      <w:r>
-        <w:t>với</w:t>
-      </w:r>
-      <w:proofErr w:type="spellEnd"/>
-      <w:r>
-        <w:t xml:space="preserve"> Remote Server:</w:t>
-      </w:r>
-      <w:bookmarkEnd w:id="20"/>
     </w:p>
     <w:p>
       <w:pPr>
@@ -8394,8 +8262,8 @@
       </w:pPr>
     </w:p>
     <w:sectPr>
-      <w:headerReference w:type="default" r:id="rId9"/>
-      <w:footerReference w:type="default" r:id="rId10"/>
+      <w:headerReference w:type="default" r:id="rId10"/>
+      <w:footerReference w:type="default" r:id="rId11"/>
       <w:pgSz w:w="12240" w:h="15840"/>
       <w:pgMar w:top="1440" w:right="1440" w:bottom="1440" w:left="1440" w:header="720" w:footer="720" w:gutter="0"/>
       <w:cols w:space="720"/>
@@ -8406,7 +8274,7 @@
 </file>
 
 <file path=word/endnotes.xml><?xml version="1.0" encoding="utf-8"?>
-<w:endnotes xmlns:wpc="http://schemas.microsoft.com/office/word/2010/wordprocessingCanvas" xmlns:cx="http://schemas.microsoft.com/office/drawing/2014/chartex" xmlns:cx1="http://schemas.microsoft.com/office/drawing/2015/9/8/chartex" xmlns:cx2="http://schemas.microsoft.com/office/drawing/2015/10/21/chartex" xmlns:cx3="http://schemas.microsoft.com/office/drawing/2016/5/9/chartex" xmlns:cx4="http://schemas.microsoft.com/office/drawing/2016/5/10/chartex" xmlns:cx5="http://schemas.microsoft.com/office/drawing/2016/5/11/chartex" xmlns:cx6="http://schemas.microsoft.com/office/drawing/2016/5/12/chartex" xmlns:cx7="http://schemas.microsoft.com/office/drawing/2016/5/13/chartex" xmlns:cx8="http://schemas.microsoft.com/office/drawing/2016/5/14/chartex" xmlns:mc="http://schemas.openxmlformats.org/markup-compatibility/2006" xmlns:aink="http://schemas.microsoft.com/office/drawing/2016/ink" xmlns:am3d="http://schemas.microsoft.com/office/drawing/2017/model3d" xmlns:o="urn:schemas-microsoft-com:office:office" xmlns:r="http://schemas.openxmlformats.org/officeDocument/2006/relationships" xmlns:m="http://schemas.openxmlformats.org/officeDocument/2006/math" xmlns:v="urn:schemas-microsoft-com:vml" xmlns:wp14="http://schemas.microsoft.com/office/word/2010/wordprocessingDrawing" xmlns:wp="http://schemas.openxmlformats.org/drawingml/2006/wordprocessingDrawing" xmlns:w10="urn:schemas-microsoft-com:office:word" xmlns:w="http://schemas.openxmlformats.org/wordprocessingml/2006/main" xmlns:w14="http://schemas.microsoft.com/office/word/2010/wordml" xmlns:w15="http://schemas.microsoft.com/office/word/2012/wordml" xmlns:w16cex="http://schemas.microsoft.com/office/word/2018/wordml/cex" xmlns:w16cid="http://schemas.microsoft.com/office/word/2016/wordml/cid" xmlns:w16="http://schemas.microsoft.com/office/word/2018/wordml" xmlns:w16se="http://schemas.microsoft.com/office/word/2015/wordml/symex" xmlns:wpg="http://schemas.microsoft.com/office/word/2010/wordprocessingGroup" xmlns:wpi="http://schemas.microsoft.com/office/word/2010/wordprocessingInk" xmlns:wne="http://schemas.microsoft.com/office/word/2006/wordml" xmlns:wps="http://schemas.microsoft.com/office/word/2010/wordprocessingShape" mc:Ignorable="w14 w15 w16se w16cid w16 w16cex wp14">
+<w:endnotes xmlns:wpc="http://schemas.microsoft.com/office/word/2010/wordprocessingCanvas" xmlns:cx="http://schemas.microsoft.com/office/drawing/2014/chartex" xmlns:cx1="http://schemas.microsoft.com/office/drawing/2015/9/8/chartex" xmlns:cx2="http://schemas.microsoft.com/office/drawing/2015/10/21/chartex" xmlns:cx3="http://schemas.microsoft.com/office/drawing/2016/5/9/chartex" xmlns:cx4="http://schemas.microsoft.com/office/drawing/2016/5/10/chartex" xmlns:cx5="http://schemas.microsoft.com/office/drawing/2016/5/11/chartex" xmlns:cx6="http://schemas.microsoft.com/office/drawing/2016/5/12/chartex" xmlns:cx7="http://schemas.microsoft.com/office/drawing/2016/5/13/chartex" xmlns:cx8="http://schemas.microsoft.com/office/drawing/2016/5/14/chartex" xmlns:mc="http://schemas.openxmlformats.org/markup-compatibility/2006" xmlns:aink="http://schemas.microsoft.com/office/drawing/2016/ink" xmlns:am3d="http://schemas.microsoft.com/office/drawing/2017/model3d" xmlns:o="urn:schemas-microsoft-com:office:office" xmlns:oel="http://schemas.microsoft.com/office/2019/extlst" xmlns:r="http://schemas.openxmlformats.org/officeDocument/2006/relationships" xmlns:m="http://schemas.openxmlformats.org/officeDocument/2006/math" xmlns:v="urn:schemas-microsoft-com:vml" xmlns:wp14="http://schemas.microsoft.com/office/word/2010/wordprocessingDrawing" xmlns:wp="http://schemas.openxmlformats.org/drawingml/2006/wordprocessingDrawing" xmlns:w10="urn:schemas-microsoft-com:office:word" xmlns:w="http://schemas.openxmlformats.org/wordprocessingml/2006/main" xmlns:w14="http://schemas.microsoft.com/office/word/2010/wordml" xmlns:w15="http://schemas.microsoft.com/office/word/2012/wordml" xmlns:w16cex="http://schemas.microsoft.com/office/word/2018/wordml/cex" xmlns:w16cid="http://schemas.microsoft.com/office/word/2016/wordml/cid" xmlns:w16="http://schemas.microsoft.com/office/word/2018/wordml" xmlns:w16sdtdh="http://schemas.microsoft.com/office/word/2020/wordml/sdtdatahash" xmlns:w16se="http://schemas.microsoft.com/office/word/2015/wordml/symex" xmlns:wpg="http://schemas.microsoft.com/office/word/2010/wordprocessingGroup" xmlns:wpi="http://schemas.microsoft.com/office/word/2010/wordprocessingInk" xmlns:wne="http://schemas.microsoft.com/office/word/2006/wordml" xmlns:wps="http://schemas.microsoft.com/office/word/2010/wordprocessingShape" mc:Ignorable="w14 w15 w16se w16cid w16 w16cex w16sdtdh wp14">
   <w:endnote w:type="separator" w:id="-1">
     <w:p>
       <w:pPr>
@@ -8431,7 +8299,7 @@
 </file>
 
 <file path=word/footer1.xml><?xml version="1.0" encoding="utf-8"?>
-<w:ftr xmlns:wpc="http://schemas.microsoft.com/office/word/2010/wordprocessingCanvas" xmlns:cx="http://schemas.microsoft.com/office/drawing/2014/chartex" xmlns:cx1="http://schemas.microsoft.com/office/drawing/2015/9/8/chartex" xmlns:cx2="http://schemas.microsoft.com/office/drawing/2015/10/21/chartex" xmlns:cx3="http://schemas.microsoft.com/office/drawing/2016/5/9/chartex" xmlns:cx4="http://schemas.microsoft.com/office/drawing/2016/5/10/chartex" xmlns:cx5="http://schemas.microsoft.com/office/drawing/2016/5/11/chartex" xmlns:cx6="http://schemas.microsoft.com/office/drawing/2016/5/12/chartex" xmlns:cx7="http://schemas.microsoft.com/office/drawing/2016/5/13/chartex" xmlns:cx8="http://schemas.microsoft.com/office/drawing/2016/5/14/chartex" xmlns:mc="http://schemas.openxmlformats.org/markup-compatibility/2006" xmlns:aink="http://schemas.microsoft.com/office/drawing/2016/ink" xmlns:am3d="http://schemas.microsoft.com/office/drawing/2017/model3d" xmlns:o="urn:schemas-microsoft-com:office:office" xmlns:r="http://schemas.openxmlformats.org/officeDocument/2006/relationships" xmlns:m="http://schemas.openxmlformats.org/officeDocument/2006/math" xmlns:v="urn:schemas-microsoft-com:vml" xmlns:wp14="http://schemas.microsoft.com/office/word/2010/wordprocessingDrawing" xmlns:wp="http://schemas.openxmlformats.org/drawingml/2006/wordprocessingDrawing" xmlns:w10="urn:schemas-microsoft-com:office:word" xmlns:w="http://schemas.openxmlformats.org/wordprocessingml/2006/main" xmlns:w14="http://schemas.microsoft.com/office/word/2010/wordml" xmlns:w15="http://schemas.microsoft.com/office/word/2012/wordml" xmlns:w16cex="http://schemas.microsoft.com/office/word/2018/wordml/cex" xmlns:w16cid="http://schemas.microsoft.com/office/word/2016/wordml/cid" xmlns:w16="http://schemas.microsoft.com/office/word/2018/wordml" xmlns:w16se="http://schemas.microsoft.com/office/word/2015/wordml/symex" xmlns:wpg="http://schemas.microsoft.com/office/word/2010/wordprocessingGroup" xmlns:wpi="http://schemas.microsoft.com/office/word/2010/wordprocessingInk" xmlns:wne="http://schemas.microsoft.com/office/word/2006/wordml" xmlns:wps="http://schemas.microsoft.com/office/word/2010/wordprocessingShape" mc:Ignorable="w14 w15 w16se w16cid w16 w16cex wp14">
+<w:ftr xmlns:wpc="http://schemas.microsoft.com/office/word/2010/wordprocessingCanvas" xmlns:cx="http://schemas.microsoft.com/office/drawing/2014/chartex" xmlns:cx1="http://schemas.microsoft.com/office/drawing/2015/9/8/chartex" xmlns:cx2="http://schemas.microsoft.com/office/drawing/2015/10/21/chartex" xmlns:cx3="http://schemas.microsoft.com/office/drawing/2016/5/9/chartex" xmlns:cx4="http://schemas.microsoft.com/office/drawing/2016/5/10/chartex" xmlns:cx5="http://schemas.microsoft.com/office/drawing/2016/5/11/chartex" xmlns:cx6="http://schemas.microsoft.com/office/drawing/2016/5/12/chartex" xmlns:cx7="http://schemas.microsoft.com/office/drawing/2016/5/13/chartex" xmlns:cx8="http://schemas.microsoft.com/office/drawing/2016/5/14/chartex" xmlns:mc="http://schemas.openxmlformats.org/markup-compatibility/2006" xmlns:aink="http://schemas.microsoft.com/office/drawing/2016/ink" xmlns:am3d="http://schemas.microsoft.com/office/drawing/2017/model3d" xmlns:o="urn:schemas-microsoft-com:office:office" xmlns:oel="http://schemas.microsoft.com/office/2019/extlst" xmlns:r="http://schemas.openxmlformats.org/officeDocument/2006/relationships" xmlns:m="http://schemas.openxmlformats.org/officeDocument/2006/math" xmlns:v="urn:schemas-microsoft-com:vml" xmlns:wp14="http://schemas.microsoft.com/office/word/2010/wordprocessingDrawing" xmlns:wp="http://schemas.openxmlformats.org/drawingml/2006/wordprocessingDrawing" xmlns:w10="urn:schemas-microsoft-com:office:word" xmlns:w="http://schemas.openxmlformats.org/wordprocessingml/2006/main" xmlns:w14="http://schemas.microsoft.com/office/word/2010/wordml" xmlns:w15="http://schemas.microsoft.com/office/word/2012/wordml" xmlns:w16cex="http://schemas.microsoft.com/office/word/2018/wordml/cex" xmlns:w16cid="http://schemas.microsoft.com/office/word/2016/wordml/cid" xmlns:w16="http://schemas.microsoft.com/office/word/2018/wordml" xmlns:w16sdtdh="http://schemas.microsoft.com/office/word/2020/wordml/sdtdatahash" xmlns:w16se="http://schemas.microsoft.com/office/word/2015/wordml/symex" xmlns:wpg="http://schemas.microsoft.com/office/word/2010/wordprocessingGroup" xmlns:wpi="http://schemas.microsoft.com/office/word/2010/wordprocessingInk" xmlns:wne="http://schemas.microsoft.com/office/word/2006/wordml" xmlns:wps="http://schemas.microsoft.com/office/word/2010/wordprocessingShape" mc:Ignorable="w14 w15 w16se w16cid w16 w16cex w16sdtdh wp14">
   <w:sdt>
     <w:sdtPr>
       <w:id w:val="968245950"/>
@@ -8487,7 +8355,7 @@
 </file>
 
 <file path=word/footnotes.xml><?xml version="1.0" encoding="utf-8"?>
-<w:footnotes xmlns:wpc="http://schemas.microsoft.com/office/word/2010/wordprocessingCanvas" xmlns:cx="http://schemas.microsoft.com/office/drawing/2014/chartex" xmlns:cx1="http://schemas.microsoft.com/office/drawing/2015/9/8/chartex" xmlns:cx2="http://schemas.microsoft.com/office/drawing/2015/10/21/chartex" xmlns:cx3="http://schemas.microsoft.com/office/drawing/2016/5/9/chartex" xmlns:cx4="http://schemas.microsoft.com/office/drawing/2016/5/10/chartex" xmlns:cx5="http://schemas.microsoft.com/office/drawing/2016/5/11/chartex" xmlns:cx6="http://schemas.microsoft.com/office/drawing/2016/5/12/chartex" xmlns:cx7="http://schemas.microsoft.com/office/drawing/2016/5/13/chartex" xmlns:cx8="http://schemas.microsoft.com/office/drawing/2016/5/14/chartex" xmlns:mc="http://schemas.openxmlformats.org/markup-compatibility/2006" xmlns:aink="http://schemas.microsoft.com/office/drawing/2016/ink" xmlns:am3d="http://schemas.microsoft.com/office/drawing/2017/model3d" xmlns:o="urn:schemas-microsoft-com:office:office" xmlns:r="http://schemas.openxmlformats.org/officeDocument/2006/relationships" xmlns:m="http://schemas.openxmlformats.org/officeDocument/2006/math" xmlns:v="urn:schemas-microsoft-com:vml" xmlns:wp14="http://schemas.microsoft.com/office/word/2010/wordprocessingDrawing" xmlns:wp="http://schemas.openxmlformats.org/drawingml/2006/wordprocessingDrawing" xmlns:w10="urn:schemas-microsoft-com:office:word" xmlns:w="http://schemas.openxmlformats.org/wordprocessingml/2006/main" xmlns:w14="http://schemas.microsoft.com/office/word/2010/wordml" xmlns:w15="http://schemas.microsoft.com/office/word/2012/wordml" xmlns:w16cex="http://schemas.microsoft.com/office/word/2018/wordml/cex" xmlns:w16cid="http://schemas.microsoft.com/office/word/2016/wordml/cid" xmlns:w16="http://schemas.microsoft.com/office/word/2018/wordml" xmlns:w16se="http://schemas.microsoft.com/office/word/2015/wordml/symex" xmlns:wpg="http://schemas.microsoft.com/office/word/2010/wordprocessingGroup" xmlns:wpi="http://schemas.microsoft.com/office/word/2010/wordprocessingInk" xmlns:wne="http://schemas.microsoft.com/office/word/2006/wordml" xmlns:wps="http://schemas.microsoft.com/office/word/2010/wordprocessingShape" mc:Ignorable="w14 w15 w16se w16cid w16 w16cex wp14">
+<w:footnotes xmlns:wpc="http://schemas.microsoft.com/office/word/2010/wordprocessingCanvas" xmlns:cx="http://schemas.microsoft.com/office/drawing/2014/chartex" xmlns:cx1="http://schemas.microsoft.com/office/drawing/2015/9/8/chartex" xmlns:cx2="http://schemas.microsoft.com/office/drawing/2015/10/21/chartex" xmlns:cx3="http://schemas.microsoft.com/office/drawing/2016/5/9/chartex" xmlns:cx4="http://schemas.microsoft.com/office/drawing/2016/5/10/chartex" xmlns:cx5="http://schemas.microsoft.com/office/drawing/2016/5/11/chartex" xmlns:cx6="http://schemas.microsoft.com/office/drawing/2016/5/12/chartex" xmlns:cx7="http://schemas.microsoft.com/office/drawing/2016/5/13/chartex" xmlns:cx8="http://schemas.microsoft.com/office/drawing/2016/5/14/chartex" xmlns:mc="http://schemas.openxmlformats.org/markup-compatibility/2006" xmlns:aink="http://schemas.microsoft.com/office/drawing/2016/ink" xmlns:am3d="http://schemas.microsoft.com/office/drawing/2017/model3d" xmlns:o="urn:schemas-microsoft-com:office:office" xmlns:oel="http://schemas.microsoft.com/office/2019/extlst" xmlns:r="http://schemas.openxmlformats.org/officeDocument/2006/relationships" xmlns:m="http://schemas.openxmlformats.org/officeDocument/2006/math" xmlns:v="urn:schemas-microsoft-com:vml" xmlns:wp14="http://schemas.microsoft.com/office/word/2010/wordprocessingDrawing" xmlns:wp="http://schemas.openxmlformats.org/drawingml/2006/wordprocessingDrawing" xmlns:w10="urn:schemas-microsoft-com:office:word" xmlns:w="http://schemas.openxmlformats.org/wordprocessingml/2006/main" xmlns:w14="http://schemas.microsoft.com/office/word/2010/wordml" xmlns:w15="http://schemas.microsoft.com/office/word/2012/wordml" xmlns:w16cex="http://schemas.microsoft.com/office/word/2018/wordml/cex" xmlns:w16cid="http://schemas.microsoft.com/office/word/2016/wordml/cid" xmlns:w16="http://schemas.microsoft.com/office/word/2018/wordml" xmlns:w16sdtdh="http://schemas.microsoft.com/office/word/2020/wordml/sdtdatahash" xmlns:w16se="http://schemas.microsoft.com/office/word/2015/wordml/symex" xmlns:wpg="http://schemas.microsoft.com/office/word/2010/wordprocessingGroup" xmlns:wpi="http://schemas.microsoft.com/office/word/2010/wordprocessingInk" xmlns:wne="http://schemas.microsoft.com/office/word/2006/wordml" xmlns:wps="http://schemas.microsoft.com/office/word/2010/wordprocessingShape" mc:Ignorable="w14 w15 w16se w16cid w16 w16cex w16sdtdh wp14">
   <w:footnote w:type="separator" w:id="-1">
     <w:p>
       <w:pPr>
@@ -8512,33 +8380,37 @@
 </file>
 
 <file path=word/header1.xml><?xml version="1.0" encoding="utf-8"?>
-<w:hdr xmlns:wpc="http://schemas.microsoft.com/office/word/2010/wordprocessingCanvas" xmlns:cx="http://schemas.microsoft.com/office/drawing/2014/chartex" xmlns:cx1="http://schemas.microsoft.com/office/drawing/2015/9/8/chartex" xmlns:cx2="http://schemas.microsoft.com/office/drawing/2015/10/21/chartex" xmlns:cx3="http://schemas.microsoft.com/office/drawing/2016/5/9/chartex" xmlns:cx4="http://schemas.microsoft.com/office/drawing/2016/5/10/chartex" xmlns:cx5="http://schemas.microsoft.com/office/drawing/2016/5/11/chartex" xmlns:cx6="http://schemas.microsoft.com/office/drawing/2016/5/12/chartex" xmlns:cx7="http://schemas.microsoft.com/office/drawing/2016/5/13/chartex" xmlns:cx8="http://schemas.microsoft.com/office/drawing/2016/5/14/chartex" xmlns:mc="http://schemas.openxmlformats.org/markup-compatibility/2006" xmlns:aink="http://schemas.microsoft.com/office/drawing/2016/ink" xmlns:am3d="http://schemas.microsoft.com/office/drawing/2017/model3d" xmlns:o="urn:schemas-microsoft-com:office:office" xmlns:r="http://schemas.openxmlformats.org/officeDocument/2006/relationships" xmlns:m="http://schemas.openxmlformats.org/officeDocument/2006/math" xmlns:v="urn:schemas-microsoft-com:vml" xmlns:wp14="http://schemas.microsoft.com/office/word/2010/wordprocessingDrawing" xmlns:wp="http://schemas.openxmlformats.org/drawingml/2006/wordprocessingDrawing" xmlns:w10="urn:schemas-microsoft-com:office:word" xmlns:w="http://schemas.openxmlformats.org/wordprocessingml/2006/main" xmlns:w14="http://schemas.microsoft.com/office/word/2010/wordml" xmlns:w15="http://schemas.microsoft.com/office/word/2012/wordml" xmlns:w16cex="http://schemas.microsoft.com/office/word/2018/wordml/cex" xmlns:w16cid="http://schemas.microsoft.com/office/word/2016/wordml/cid" xmlns:w16="http://schemas.microsoft.com/office/word/2018/wordml" xmlns:w16se="http://schemas.microsoft.com/office/word/2015/wordml/symex" xmlns:wpg="http://schemas.microsoft.com/office/word/2010/wordprocessingGroup" xmlns:wpi="http://schemas.microsoft.com/office/word/2010/wordprocessingInk" xmlns:wne="http://schemas.microsoft.com/office/word/2006/wordml" xmlns:wps="http://schemas.microsoft.com/office/word/2010/wordprocessingShape" mc:Ignorable="w14 w15 w16se w16cid w16 w16cex wp14">
+<w:hdr xmlns:wpc="http://schemas.microsoft.com/office/word/2010/wordprocessingCanvas" xmlns:cx="http://schemas.microsoft.com/office/drawing/2014/chartex" xmlns:cx1="http://schemas.microsoft.com/office/drawing/2015/9/8/chartex" xmlns:cx2="http://schemas.microsoft.com/office/drawing/2015/10/21/chartex" xmlns:cx3="http://schemas.microsoft.com/office/drawing/2016/5/9/chartex" xmlns:cx4="http://schemas.microsoft.com/office/drawing/2016/5/10/chartex" xmlns:cx5="http://schemas.microsoft.com/office/drawing/2016/5/11/chartex" xmlns:cx6="http://schemas.microsoft.com/office/drawing/2016/5/12/chartex" xmlns:cx7="http://schemas.microsoft.com/office/drawing/2016/5/13/chartex" xmlns:cx8="http://schemas.microsoft.com/office/drawing/2016/5/14/chartex" xmlns:mc="http://schemas.openxmlformats.org/markup-compatibility/2006" xmlns:aink="http://schemas.microsoft.com/office/drawing/2016/ink" xmlns:am3d="http://schemas.microsoft.com/office/drawing/2017/model3d" xmlns:o="urn:schemas-microsoft-com:office:office" xmlns:oel="http://schemas.microsoft.com/office/2019/extlst" xmlns:r="http://schemas.openxmlformats.org/officeDocument/2006/relationships" xmlns:m="http://schemas.openxmlformats.org/officeDocument/2006/math" xmlns:v="urn:schemas-microsoft-com:vml" xmlns:wp14="http://schemas.microsoft.com/office/word/2010/wordprocessingDrawing" xmlns:wp="http://schemas.openxmlformats.org/drawingml/2006/wordprocessingDrawing" xmlns:w10="urn:schemas-microsoft-com:office:word" xmlns:w="http://schemas.openxmlformats.org/wordprocessingml/2006/main" xmlns:w14="http://schemas.microsoft.com/office/word/2010/wordml" xmlns:w15="http://schemas.microsoft.com/office/word/2012/wordml" xmlns:w16cex="http://schemas.microsoft.com/office/word/2018/wordml/cex" xmlns:w16cid="http://schemas.microsoft.com/office/word/2016/wordml/cid" xmlns:w16="http://schemas.microsoft.com/office/word/2018/wordml" xmlns:w16sdtdh="http://schemas.microsoft.com/office/word/2020/wordml/sdtdatahash" xmlns:w16se="http://schemas.microsoft.com/office/word/2015/wordml/symex" xmlns:wpg="http://schemas.microsoft.com/office/word/2010/wordprocessingGroup" xmlns:wpi="http://schemas.microsoft.com/office/word/2010/wordprocessingInk" xmlns:wne="http://schemas.microsoft.com/office/word/2006/wordml" xmlns:wps="http://schemas.microsoft.com/office/word/2010/wordprocessingShape" mc:Ignorable="w14 w15 w16se w16cid w16 w16cex w16sdtdh wp14">
   <w:p>
     <w:pPr>
       <w:pStyle w:val="Header"/>
+      <w:rPr>
+        <w:lang w:val="vi-VN"/>
+      </w:rPr>
     </w:pPr>
     <w:r>
-      <w:t xml:space="preserve">Bai Lam </w:t>
+      <w:t>Nguyen</w:t>
     </w:r>
-    <w:proofErr w:type="spellStart"/>
     <w:r>
-      <w:t>cua</w:t>
+      <w:rPr>
+        <w:lang w:val="vi-VN"/>
+      </w:rPr>
+      <w:t xml:space="preserve"> Quang Minh</w:t>
     </w:r>
-    <w:proofErr w:type="spellEnd"/>
-    <w:r>
-      <w:t xml:space="preserve"> </w:t>
-    </w:r>
-    <w:proofErr w:type="spellStart"/>
-    <w:r>
-      <w:t>dic</w:t>
-    </w:r>
-    <w:proofErr w:type="spellEnd"/>
+  </w:p>
+  <w:p>
+    <w:pPr>
+      <w:pStyle w:val="Header"/>
+      <w:rPr>
+        <w:lang w:val="vi-VN"/>
+      </w:rPr>
+    </w:pPr>
   </w:p>
 </w:hdr>
 </file>
 
 <file path=word/numbering.xml><?xml version="1.0" encoding="utf-8"?>
-<w:numbering xmlns:wpc="http://schemas.microsoft.com/office/word/2010/wordprocessingCanvas" xmlns:cx="http://schemas.microsoft.com/office/drawing/2014/chartex" xmlns:cx1="http://schemas.microsoft.com/office/drawing/2015/9/8/chartex" xmlns:cx2="http://schemas.microsoft.com/office/drawing/2015/10/21/chartex" xmlns:cx3="http://schemas.microsoft.com/office/drawing/2016/5/9/chartex" xmlns:cx4="http://schemas.microsoft.com/office/drawing/2016/5/10/chartex" xmlns:cx5="http://schemas.microsoft.com/office/drawing/2016/5/11/chartex" xmlns:cx6="http://schemas.microsoft.com/office/drawing/2016/5/12/chartex" xmlns:cx7="http://schemas.microsoft.com/office/drawing/2016/5/13/chartex" xmlns:cx8="http://schemas.microsoft.com/office/drawing/2016/5/14/chartex" xmlns:mc="http://schemas.openxmlformats.org/markup-compatibility/2006" xmlns:aink="http://schemas.microsoft.com/office/drawing/2016/ink" xmlns:am3d="http://schemas.microsoft.com/office/drawing/2017/model3d" xmlns:o="urn:schemas-microsoft-com:office:office" xmlns:r="http://schemas.openxmlformats.org/officeDocument/2006/relationships" xmlns:m="http://schemas.openxmlformats.org/officeDocument/2006/math" xmlns:v="urn:schemas-microsoft-com:vml" xmlns:wp14="http://schemas.microsoft.com/office/word/2010/wordprocessingDrawing" xmlns:wp="http://schemas.openxmlformats.org/drawingml/2006/wordprocessingDrawing" xmlns:w10="urn:schemas-microsoft-com:office:word" xmlns:w="http://schemas.openxmlformats.org/wordprocessingml/2006/main" xmlns:w14="http://schemas.microsoft.com/office/word/2010/wordml" xmlns:w15="http://schemas.microsoft.com/office/word/2012/wordml" xmlns:w16cex="http://schemas.microsoft.com/office/word/2018/wordml/cex" xmlns:w16cid="http://schemas.microsoft.com/office/word/2016/wordml/cid" xmlns:w16="http://schemas.microsoft.com/office/word/2018/wordml" xmlns:w16se="http://schemas.microsoft.com/office/word/2015/wordml/symex" xmlns:wpg="http://schemas.microsoft.com/office/word/2010/wordprocessingGroup" xmlns:wpi="http://schemas.microsoft.com/office/word/2010/wordprocessingInk" xmlns:wne="http://schemas.microsoft.com/office/word/2006/wordml" xmlns:wps="http://schemas.microsoft.com/office/word/2010/wordprocessingShape" mc:Ignorable="w14 w15 w16se w16cid w16 w16cex wp14">
+<w:numbering xmlns:wpc="http://schemas.microsoft.com/office/word/2010/wordprocessingCanvas" xmlns:cx="http://schemas.microsoft.com/office/drawing/2014/chartex" xmlns:cx1="http://schemas.microsoft.com/office/drawing/2015/9/8/chartex" xmlns:cx2="http://schemas.microsoft.com/office/drawing/2015/10/21/chartex" xmlns:cx3="http://schemas.microsoft.com/office/drawing/2016/5/9/chartex" xmlns:cx4="http://schemas.microsoft.com/office/drawing/2016/5/10/chartex" xmlns:cx5="http://schemas.microsoft.com/office/drawing/2016/5/11/chartex" xmlns:cx6="http://schemas.microsoft.com/office/drawing/2016/5/12/chartex" xmlns:cx7="http://schemas.microsoft.com/office/drawing/2016/5/13/chartex" xmlns:cx8="http://schemas.microsoft.com/office/drawing/2016/5/14/chartex" xmlns:mc="http://schemas.openxmlformats.org/markup-compatibility/2006" xmlns:aink="http://schemas.microsoft.com/office/drawing/2016/ink" xmlns:am3d="http://schemas.microsoft.com/office/drawing/2017/model3d" xmlns:o="urn:schemas-microsoft-com:office:office" xmlns:oel="http://schemas.microsoft.com/office/2019/extlst" xmlns:r="http://schemas.openxmlformats.org/officeDocument/2006/relationships" xmlns:m="http://schemas.openxmlformats.org/officeDocument/2006/math" xmlns:v="urn:schemas-microsoft-com:vml" xmlns:wp14="http://schemas.microsoft.com/office/word/2010/wordprocessingDrawing" xmlns:wp="http://schemas.openxmlformats.org/drawingml/2006/wordprocessingDrawing" xmlns:w10="urn:schemas-microsoft-com:office:word" xmlns:w="http://schemas.openxmlformats.org/wordprocessingml/2006/main" xmlns:w14="http://schemas.microsoft.com/office/word/2010/wordml" xmlns:w15="http://schemas.microsoft.com/office/word/2012/wordml" xmlns:w16cex="http://schemas.microsoft.com/office/word/2018/wordml/cex" xmlns:w16cid="http://schemas.microsoft.com/office/word/2016/wordml/cid" xmlns:w16="http://schemas.microsoft.com/office/word/2018/wordml" xmlns:w16sdtdh="http://schemas.microsoft.com/office/word/2020/wordml/sdtdatahash" xmlns:w16se="http://schemas.microsoft.com/office/word/2015/wordml/symex" xmlns:wpg="http://schemas.microsoft.com/office/word/2010/wordprocessingGroup" xmlns:wpi="http://schemas.microsoft.com/office/word/2010/wordprocessingInk" xmlns:wne="http://schemas.microsoft.com/office/word/2006/wordml" xmlns:wps="http://schemas.microsoft.com/office/word/2010/wordprocessingShape" mc:Ignorable="w14 w15 w16se w16cid w16 w16cex w16sdtdh wp14">
   <w:abstractNum w:abstractNumId="0" w15:restartNumberingAfterBreak="0">
     <w:nsid w:val="254C06A6"/>
     <w:multiLevelType w:val="multilevel"/>
@@ -8899,20 +8771,20 @@
       </w:rPr>
     </w:lvl>
   </w:abstractNum>
-  <w:num w:numId="1">
+  <w:num w:numId="1" w16cid:durableId="599534446">
     <w:abstractNumId w:val="0"/>
   </w:num>
-  <w:num w:numId="2">
+  <w:num w:numId="2" w16cid:durableId="834882890">
     <w:abstractNumId w:val="2"/>
   </w:num>
-  <w:num w:numId="3">
+  <w:num w:numId="3" w16cid:durableId="1004088100">
     <w:abstractNumId w:val="1"/>
   </w:num>
 </w:numbering>
 </file>
 
 <file path=word/styles.xml><?xml version="1.0" encoding="utf-8"?>
-<w:styles xmlns:mc="http://schemas.openxmlformats.org/markup-compatibility/2006" xmlns:r="http://schemas.openxmlformats.org/officeDocument/2006/relationships" xmlns:w="http://schemas.openxmlformats.org/wordprocessingml/2006/main" xmlns:w14="http://schemas.microsoft.com/office/word/2010/wordml" xmlns:w15="http://schemas.microsoft.com/office/word/2012/wordml" xmlns:w16cex="http://schemas.microsoft.com/office/word/2018/wordml/cex" xmlns:w16cid="http://schemas.microsoft.com/office/word/2016/wordml/cid" xmlns:w16="http://schemas.microsoft.com/office/word/2018/wordml" xmlns:w16se="http://schemas.microsoft.com/office/word/2015/wordml/symex" mc:Ignorable="w14 w15 w16se w16cid w16 w16cex">
+<w:styles xmlns:mc="http://schemas.openxmlformats.org/markup-compatibility/2006" xmlns:r="http://schemas.openxmlformats.org/officeDocument/2006/relationships" xmlns:w="http://schemas.openxmlformats.org/wordprocessingml/2006/main" xmlns:w14="http://schemas.microsoft.com/office/word/2010/wordml" xmlns:w15="http://schemas.microsoft.com/office/word/2012/wordml" xmlns:w16cex="http://schemas.microsoft.com/office/word/2018/wordml/cex" xmlns:w16cid="http://schemas.microsoft.com/office/word/2016/wordml/cid" xmlns:w16="http://schemas.microsoft.com/office/word/2018/wordml" xmlns:w16sdtdh="http://schemas.microsoft.com/office/word/2020/wordml/sdtdatahash" xmlns:w16se="http://schemas.microsoft.com/office/word/2015/wordml/symex" mc:Ignorable="w14 w15 w16se w16cid w16 w16cex w16sdtdh">
   <w:docDefaults>
     <w:rPrDefault>
       <w:rPr>
@@ -9372,6 +9244,7 @@
   <w:style w:type="character" w:default="1" w:styleId="DefaultParagraphFont">
     <w:name w:val="Default Paragraph Font"/>
     <w:uiPriority w:val="1"/>
+    <w:semiHidden/>
     <w:unhideWhenUsed/>
   </w:style>
   <w:style w:type="table" w:default="1" w:styleId="TableNormal">

</xml_diff>